<commit_message>
Update 1.7 lab report
</commit_message>
<xml_diff>
--- a/1.7-Performance-Assessment/LabReport_Assessment_BoxModelInventory.docx
+++ b/1.7-Performance-Assessment/LabReport_Assessment_BoxModelInventory.docx
@@ -1,13 +1,13 @@
 
 <file path=word/document.xml><?xml version="1.0" encoding="utf-8"?>
-<w:document xmlns:wpc="http://schemas.microsoft.com/office/word/2010/wordprocessingCanvas" xmlns:cx="http://schemas.microsoft.com/office/drawing/2014/chartex" xmlns:cx1="http://schemas.microsoft.com/office/drawing/2015/9/8/chartex" xmlns:cx2="http://schemas.microsoft.com/office/drawing/2015/10/21/chartex" xmlns:cx3="http://schemas.microsoft.com/office/drawing/2016/5/9/chartex" xmlns:cx4="http://schemas.microsoft.com/office/drawing/2016/5/10/chartex" xmlns:cx5="http://schemas.microsoft.com/office/drawing/2016/5/11/chartex" xmlns:cx6="http://schemas.microsoft.com/office/drawing/2016/5/12/chartex" xmlns:cx7="http://schemas.microsoft.com/office/drawing/2016/5/13/chartex" xmlns:cx8="http://schemas.microsoft.com/office/drawing/2016/5/14/chartex" xmlns:mc="http://schemas.openxmlformats.org/markup-compatibility/2006" xmlns:aink="http://schemas.microsoft.com/office/drawing/2016/ink" xmlns:am3d="http://schemas.microsoft.com/office/drawing/2017/model3d" xmlns:o="urn:schemas-microsoft-com:office:office" xmlns:oel="http://schemas.microsoft.com/office/2019/extlst" xmlns:r="http://schemas.openxmlformats.org/officeDocument/2006/relationships" xmlns:m="http://schemas.openxmlformats.org/officeDocument/2006/math" xmlns:v="urn:schemas-microsoft-com:vml" xmlns:wp14="http://schemas.microsoft.com/office/word/2010/wordprocessingDrawing" xmlns:wp="http://schemas.openxmlformats.org/drawingml/2006/wordprocessingDrawing" xmlns:w10="urn:schemas-microsoft-com:office:word" xmlns:w="http://schemas.openxmlformats.org/wordprocessingml/2006/main" xmlns:w14="http://schemas.microsoft.com/office/word/2010/wordml" xmlns:w15="http://schemas.microsoft.com/office/word/2012/wordml" xmlns:w16cex="http://schemas.microsoft.com/office/word/2018/wordml/cex" xmlns:w16cid="http://schemas.microsoft.com/office/word/2016/wordml/cid" xmlns:w16="http://schemas.microsoft.com/office/word/2018/wordml" xmlns:w16du="http://schemas.microsoft.com/office/word/2023/wordml/word16du" xmlns:w16sdtdh="http://schemas.microsoft.com/office/word/2020/wordml/sdtdatahash" xmlns:w16sdtfl="http://schemas.microsoft.com/office/word/2024/wordml/sdtformatlock" xmlns:w16se="http://schemas.microsoft.com/office/word/2015/wordml/symex" xmlns:wpg="http://schemas.microsoft.com/office/word/2010/wordprocessingGroup" xmlns:wpi="http://schemas.microsoft.com/office/word/2010/wordprocessingInk" xmlns:wne="http://schemas.microsoft.com/office/word/2006/wordml" xmlns:wps="http://schemas.microsoft.com/office/word/2010/wordprocessingShape" mc:Ignorable="w14 w15 w16se w16cid w16 w16cex w16sdtdh w16sdtfl w16du wp14">
+<w:document xmlns:wpc="http://schemas.microsoft.com/office/word/2010/wordprocessingCanvas" xmlns:cx="http://schemas.microsoft.com/office/drawing/2014/chartex" xmlns:cx1="http://schemas.microsoft.com/office/drawing/2015/9/8/chartex" xmlns:cx2="http://schemas.microsoft.com/office/drawing/2015/10/21/chartex" xmlns:cx3="http://schemas.microsoft.com/office/drawing/2016/5/9/chartex" xmlns:cx4="http://schemas.microsoft.com/office/drawing/2016/5/10/chartex" xmlns:cx5="http://schemas.microsoft.com/office/drawing/2016/5/11/chartex" xmlns:cx6="http://schemas.microsoft.com/office/drawing/2016/5/12/chartex" xmlns:cx7="http://schemas.microsoft.com/office/drawing/2016/5/13/chartex" xmlns:cx8="http://schemas.microsoft.com/office/drawing/2016/5/14/chartex" xmlns:mc="http://schemas.openxmlformats.org/markup-compatibility/2006" xmlns:aink="http://schemas.microsoft.com/office/drawing/2016/ink" xmlns:am3d="http://schemas.microsoft.com/office/drawing/2017/model3d" xmlns:o="urn:schemas-microsoft-com:office:office" xmlns:oel="http://schemas.microsoft.com/office/2019/extlst" xmlns:r="http://schemas.openxmlformats.org/officeDocument/2006/relationships" xmlns:m="http://schemas.openxmlformats.org/officeDocument/2006/math" xmlns:v="urn:schemas-microsoft-com:vml" xmlns:wp14="http://schemas.microsoft.com/office/word/2010/wordprocessingDrawing" xmlns:wp="http://schemas.openxmlformats.org/drawingml/2006/wordprocessingDrawing" xmlns:w10="urn:schemas-microsoft-com:office:word" xmlns:w="http://schemas.openxmlformats.org/wordprocessingml/2006/main" xmlns:w14="http://schemas.microsoft.com/office/word/2010/wordml" xmlns:w15="http://schemas.microsoft.com/office/word/2012/wordml" xmlns:w16cei="http://schemas.microsoft.com/office/word/2026/wordml/cei" xmlns:w16cex="http://schemas.microsoft.com/office/word/2018/wordml/cex" xmlns:w16cid="http://schemas.microsoft.com/office/word/2016/wordml/cid" xmlns:w16="http://schemas.microsoft.com/office/word/2018/wordml" xmlns:w16du="http://schemas.microsoft.com/office/word/2023/wordml/word16du" xmlns:w16sdtdh="http://schemas.microsoft.com/office/word/2020/wordml/sdtdatahash" xmlns:w16sdtfl="http://schemas.microsoft.com/office/word/2024/wordml/sdtformatlock" xmlns:w16se="http://schemas.microsoft.com/office/word/2015/wordml/symex" xmlns:wpg="http://schemas.microsoft.com/office/word/2010/wordprocessingGroup" xmlns:wpi="http://schemas.microsoft.com/office/word/2010/wordprocessingInk" xmlns:wne="http://schemas.microsoft.com/office/word/2006/wordml" xmlns:wps="http://schemas.microsoft.com/office/word/2010/wordprocessingShape" mc:Ignorable="w14 w15 w16se w16cid w16 w16cex w16sdtdh w16sdtfl w16du wp14">
   <w:body>
     <w:p>
       <w:pPr>
         <w:pStyle w:val="Title"/>
       </w:pPr>
       <w:r>
-        <w:t xml:space="preserve">Assessment – Box Model Inventory Lab Report</w:t>
+        <w:t>Assessment – Box Model Inventory Lab Report</w:t>
       </w:r>
     </w:p>
     <w:p>
@@ -25,19 +25,17 @@
     </w:p>
     <w:p>
       <w:r>
-        <w:t xml:space="preserve">Your Name: Daryl Hymel - darhym6254</w:t>
+        <w:t>Your Name: Daryl Hymel - darhym6254</w:t>
       </w:r>
     </w:p>
     <w:p>
       <w:r>
-        <w:rPr/>
-        <w:t xml:space="preserve">Assignment Title: 1.7 Performance Assessment - Box Model Inventory</w:t>
+        <w:t>Assignment Title: 1.7 Performance Assessment - Box Model Inventory</w:t>
       </w:r>
     </w:p>
     <w:p>
       <w:r>
-        <w:rPr/>
-        <w:t xml:space="preserve">GitHub Repository: https://github.com/darhym6254/SDC260-Web-Dev-Class/tree/main/1.7-Performance-Assessment</w:t>
+        <w:t>GitHub Repository: https://github.com/darhym6254/SDC260-Web-Dev-Class/tree/main/1.7-Performance-Assessment</w:t>
       </w:r>
     </w:p>
     <w:p>
@@ -55,31 +53,9 @@
     </w:p>
     <w:p>
       <w:r>
-        <w:t xml:space="preserve">I built a figurine inventory page that lists the pieces in a collection and separates the page into clearly defined blocks of content.</w:t>
+        <w:t>I created a figurine inventory page using semantic HTML elements such as &lt;nav&gt;, &lt;main&gt;, &lt;section&gt;, &lt;article&gt;, and &lt;aside&gt;. I added a table with five figurines, including their series, condition, and value. I also used padding, borders, margins, and width settings to organize the page and make the content easier to read.</w:t>
       </w:r>
     </w:p>
-    <w:p>
-      <w:r>
-        <w:t xml:space="preserve">Semantic elements. Beyond the &lt;header&gt; and &lt;footer&gt; that came with the starter file, I added a &lt;nav&gt; for the in-page links, a &lt;main&gt; to wrap the primary content, two &lt;section&gt; elements for the inventory and the collection highlight, an &lt;article&gt; for the write-up of the highlighted figurine, and an &lt;aside&gt; for the care notes. Every block is identified by the element that wraps it instead of by a generic container.</w:t>
-      </w:r>
-    </w:p>
-    <w:p>
-      <w:r>
-        <w:t xml:space="preserve">Inventory data. The table has a header row and five data rows across four columns: Figurine, Series, Condition, and Value. Each row records a figurine's name, the set it belongs to, its grading condition, and its estimated dollar value, so the pieces can be compared at a glance.</w:t>
-      </w:r>
-    </w:p>
-    <w:p>
-      <w:r>
-        <w:t xml:space="preserve">Box model. The internal stylesheet uses box model properties throughout. The body has a fixed width with automatic side margins to center the page, plus padding inside its edge. Each &lt;section&gt; has a border, padding between that border and its content, and a bottom margin that separates it from the next section. The table cells use padding so the data does not crowd the cell borders, and the &lt;aside&gt; uses a narrower width, a thick left border as an accent bar, and vertical margins to set it apart from the main content. The footer is styled with inline rules that add a top border, padding, and a top margin.</w:t>
-      </w:r>
-    </w:p>
-    <w:p>
-      <w:r>
-        <w:t xml:space="preserve">Taken together, the padding creates breathing room inside each box, the borders make the edge of each box visible, and the margins keep the boxes from touching one another. That is what turns a plain stack of text into an organized, readable page.</w:t>
-      </w:r>
-    </w:p>
-    <w:p/>
-    <w:p/>
     <w:p>
       <w:pPr>
         <w:pStyle w:val="Heading1"/>
@@ -100,9 +76,9 @@
         <w:tblLook w:val="04A0" w:firstRow="1" w:lastRow="0" w:firstColumn="1" w:lastColumn="0" w:noHBand="0" w:noVBand="1"/>
       </w:tblPr>
       <w:tblGrid>
-        <w:gridCol w:w="3110"/>
-        <w:gridCol w:w="3035"/>
-        <w:gridCol w:w="3055"/>
+        <w:gridCol w:w="3087"/>
+        <w:gridCol w:w="3080"/>
+        <w:gridCol w:w="3033"/>
       </w:tblGrid>
       <w:tr>
         <w:trPr>
@@ -112,13 +88,12 @@
           <w:tcPr>
             <w:tcW w:w="3360" w:type="dxa"/>
             <w:tcBorders>
-              <w:top w:val="single" w:color="BFBFBF" w:themeColor="background1" w:themeShade="BF" w:sz="6" w:space="0"/>
-              <w:left w:val="single" w:color="BFBFBF" w:themeColor="background1" w:themeShade="BF" w:sz="6" w:space="0"/>
-              <w:bottom w:val="single" w:color="BFBFBF" w:themeColor="background1" w:themeShade="BF" w:sz="6" w:space="0"/>
-              <w:right w:val="single" w:color="BFBFBF" w:themeColor="background1" w:themeShade="BF" w:sz="6" w:space="0"/>
+              <w:top w:val="single" w:sz="6" w:space="0" w:color="BFBFBF" w:themeColor="background1" w:themeShade="BF"/>
+              <w:left w:val="single" w:sz="6" w:space="0" w:color="BFBFBF" w:themeColor="background1" w:themeShade="BF"/>
+              <w:bottom w:val="single" w:sz="6" w:space="0" w:color="BFBFBF" w:themeColor="background1" w:themeShade="BF"/>
+              <w:right w:val="single" w:sz="6" w:space="0" w:color="BFBFBF" w:themeColor="background1" w:themeShade="BF"/>
             </w:tcBorders>
             <w:shd w:val="clear" w:color="auto" w:fill="EAF2F8"/>
-            <w:tcMar/>
             <w:hideMark/>
           </w:tcPr>
           <w:p>
@@ -131,13 +106,12 @@
           <w:tcPr>
             <w:tcW w:w="3360" w:type="dxa"/>
             <w:tcBorders>
-              <w:top w:val="single" w:color="BFBFBF" w:themeColor="background1" w:themeShade="BF" w:sz="6" w:space="0"/>
-              <w:left w:val="single" w:color="BFBFBF" w:themeColor="background1" w:themeShade="BF" w:sz="6" w:space="0"/>
-              <w:bottom w:val="single" w:color="BFBFBF" w:themeColor="background1" w:themeShade="BF" w:sz="6" w:space="0"/>
-              <w:right w:val="single" w:color="BFBFBF" w:themeColor="background1" w:themeShade="BF" w:sz="6" w:space="0"/>
+              <w:top w:val="single" w:sz="6" w:space="0" w:color="BFBFBF" w:themeColor="background1" w:themeShade="BF"/>
+              <w:left w:val="single" w:sz="6" w:space="0" w:color="BFBFBF" w:themeColor="background1" w:themeShade="BF"/>
+              <w:bottom w:val="single" w:sz="6" w:space="0" w:color="BFBFBF" w:themeColor="background1" w:themeShade="BF"/>
+              <w:right w:val="single" w:sz="6" w:space="0" w:color="BFBFBF" w:themeColor="background1" w:themeShade="BF"/>
             </w:tcBorders>
             <w:shd w:val="clear" w:color="auto" w:fill="EAF2F8"/>
-            <w:tcMar/>
             <w:hideMark/>
           </w:tcPr>
           <w:p>
@@ -150,13 +124,12 @@
           <w:tcPr>
             <w:tcW w:w="3360" w:type="dxa"/>
             <w:tcBorders>
-              <w:top w:val="single" w:color="BFBFBF" w:themeColor="background1" w:themeShade="BF" w:sz="6" w:space="0"/>
-              <w:left w:val="single" w:color="BFBFBF" w:themeColor="background1" w:themeShade="BF" w:sz="6" w:space="0"/>
-              <w:bottom w:val="single" w:color="BFBFBF" w:themeColor="background1" w:themeShade="BF" w:sz="6" w:space="0"/>
-              <w:right w:val="single" w:color="BFBFBF" w:themeColor="background1" w:themeShade="BF" w:sz="6" w:space="0"/>
+              <w:top w:val="single" w:sz="6" w:space="0" w:color="BFBFBF" w:themeColor="background1" w:themeShade="BF"/>
+              <w:left w:val="single" w:sz="6" w:space="0" w:color="BFBFBF" w:themeColor="background1" w:themeShade="BF"/>
+              <w:bottom w:val="single" w:sz="6" w:space="0" w:color="BFBFBF" w:themeColor="background1" w:themeShade="BF"/>
+              <w:right w:val="single" w:sz="6" w:space="0" w:color="BFBFBF" w:themeColor="background1" w:themeShade="BF"/>
             </w:tcBorders>
             <w:shd w:val="clear" w:color="auto" w:fill="EAF2F8"/>
-            <w:tcMar/>
             <w:hideMark/>
           </w:tcPr>
           <w:p>
@@ -174,12 +147,11 @@
           <w:tcPr>
             <w:tcW w:w="3360" w:type="dxa"/>
             <w:tcBorders>
-              <w:top w:val="single" w:color="BFBFBF" w:themeColor="background1" w:themeShade="BF" w:sz="6" w:space="0"/>
-              <w:left w:val="single" w:color="BFBFBF" w:themeColor="background1" w:themeShade="BF" w:sz="6" w:space="0"/>
-              <w:bottom w:val="single" w:color="BFBFBF" w:themeColor="background1" w:themeShade="BF" w:sz="6" w:space="0"/>
-              <w:right w:val="single" w:color="BFBFBF" w:themeColor="background1" w:themeShade="BF" w:sz="6" w:space="0"/>
+              <w:top w:val="single" w:sz="6" w:space="0" w:color="BFBFBF" w:themeColor="background1" w:themeShade="BF"/>
+              <w:left w:val="single" w:sz="6" w:space="0" w:color="BFBFBF" w:themeColor="background1" w:themeShade="BF"/>
+              <w:bottom w:val="single" w:sz="6" w:space="0" w:color="BFBFBF" w:themeColor="background1" w:themeShade="BF"/>
+              <w:right w:val="single" w:sz="6" w:space="0" w:color="BFBFBF" w:themeColor="background1" w:themeShade="BF"/>
             </w:tcBorders>
-            <w:tcMar/>
             <w:hideMark/>
           </w:tcPr>
           <w:p>
@@ -192,16 +164,15 @@
           <w:tcPr>
             <w:tcW w:w="3360" w:type="dxa"/>
             <w:tcBorders>
-              <w:top w:val="single" w:color="BFBFBF" w:themeColor="background1" w:themeShade="BF" w:sz="6" w:space="0"/>
-              <w:left w:val="single" w:color="BFBFBF" w:themeColor="background1" w:themeShade="BF" w:sz="6" w:space="0"/>
-              <w:bottom w:val="single" w:color="BFBFBF" w:themeColor="background1" w:themeShade="BF" w:sz="6" w:space="0"/>
-              <w:right w:val="single" w:color="BFBFBF" w:themeColor="background1" w:themeShade="BF" w:sz="6" w:space="0"/>
+              <w:top w:val="single" w:sz="6" w:space="0" w:color="BFBFBF" w:themeColor="background1" w:themeShade="BF"/>
+              <w:left w:val="single" w:sz="6" w:space="0" w:color="BFBFBF" w:themeColor="background1" w:themeShade="BF"/>
+              <w:bottom w:val="single" w:sz="6" w:space="0" w:color="BFBFBF" w:themeColor="background1" w:themeShade="BF"/>
+              <w:right w:val="single" w:sz="6" w:space="0" w:color="BFBFBF" w:themeColor="background1" w:themeShade="BF"/>
             </w:tcBorders>
-            <w:tcMar/>
           </w:tcPr>
           <w:p>
             <w:r>
-              <w:t xml:space="preserve">Added five semantic elements beyond the starter file's &lt;header&gt; and &lt;footer&gt;: &lt;nav&gt;, &lt;main&gt;, &lt;section&gt; (used twice), &lt;article&gt;, and &lt;aside&gt;.</w:t>
+              <w:t>Added five semantic elements beyond the starter file's &lt;header&gt; and &lt;footer&gt;: &lt;nav&gt;, &lt;main&gt;, &lt;section&gt; (used twice), &lt;article&gt;, and &lt;aside&gt;.</w:t>
             </w:r>
           </w:p>
         </w:tc>
@@ -209,16 +180,36 @@
           <w:tcPr>
             <w:tcW w:w="3360" w:type="dxa"/>
             <w:tcBorders>
-              <w:top w:val="single" w:color="BFBFBF" w:themeColor="background1" w:themeShade="BF" w:sz="6" w:space="0"/>
-              <w:left w:val="single" w:color="BFBFBF" w:themeColor="background1" w:themeShade="BF" w:sz="6" w:space="0"/>
-              <w:bottom w:val="single" w:color="BFBFBF" w:themeColor="background1" w:themeShade="BF" w:sz="6" w:space="0"/>
-              <w:right w:val="single" w:color="BFBFBF" w:themeColor="background1" w:themeShade="BF" w:sz="6" w:space="0"/>
+              <w:top w:val="single" w:sz="6" w:space="0" w:color="BFBFBF" w:themeColor="background1" w:themeShade="BF"/>
+              <w:left w:val="single" w:sz="6" w:space="0" w:color="BFBFBF" w:themeColor="background1" w:themeShade="BF"/>
+              <w:bottom w:val="single" w:sz="6" w:space="0" w:color="BFBFBF" w:themeColor="background1" w:themeShade="BF"/>
+              <w:right w:val="single" w:sz="6" w:space="0" w:color="BFBFBF" w:themeColor="background1" w:themeShade="BF"/>
             </w:tcBorders>
-            <w:tcMar/>
           </w:tcPr>
           <w:p>
             <w:r>
-              <w:t xml:space="preserve">&lt;nav&gt; line 82, &lt;main&gt; line 88, &lt;section&gt; lines 90 and 132, &lt;article&gt; line 134, &lt;aside&gt; line 144.</w:t>
+              <w:t xml:space="preserve">line 82, </w:t>
+            </w:r>
+            <w:r>
+              <w:t xml:space="preserve">88, </w:t>
+            </w:r>
+            <w:r>
+              <w:t>90</w:t>
+            </w:r>
+            <w:r>
+              <w:t xml:space="preserve">, </w:t>
+            </w:r>
+            <w:r>
+              <w:t>132,</w:t>
+            </w:r>
+            <w:r>
+              <w:t xml:space="preserve"> </w:t>
+            </w:r>
+            <w:r>
+              <w:t>134,</w:t>
+            </w:r>
+            <w:r>
+              <w:t>144.</w:t>
             </w:r>
           </w:p>
         </w:tc>
@@ -231,12 +222,11 @@
           <w:tcPr>
             <w:tcW w:w="3360" w:type="dxa"/>
             <w:tcBorders>
-              <w:top w:val="single" w:color="BFBFBF" w:themeColor="background1" w:themeShade="BF" w:sz="6" w:space="0"/>
-              <w:left w:val="single" w:color="BFBFBF" w:themeColor="background1" w:themeShade="BF" w:sz="6" w:space="0"/>
-              <w:bottom w:val="single" w:color="BFBFBF" w:themeColor="background1" w:themeShade="BF" w:sz="6" w:space="0"/>
-              <w:right w:val="single" w:color="BFBFBF" w:themeColor="background1" w:themeShade="BF" w:sz="6" w:space="0"/>
+              <w:top w:val="single" w:sz="6" w:space="0" w:color="BFBFBF" w:themeColor="background1" w:themeShade="BF"/>
+              <w:left w:val="single" w:sz="6" w:space="0" w:color="BFBFBF" w:themeColor="background1" w:themeShade="BF"/>
+              <w:bottom w:val="single" w:sz="6" w:space="0" w:color="BFBFBF" w:themeColor="background1" w:themeShade="BF"/>
+              <w:right w:val="single" w:sz="6" w:space="0" w:color="BFBFBF" w:themeColor="background1" w:themeShade="BF"/>
             </w:tcBorders>
-            <w:tcMar/>
             <w:hideMark/>
           </w:tcPr>
           <w:p>
@@ -249,16 +239,15 @@
           <w:tcPr>
             <w:tcW w:w="3360" w:type="dxa"/>
             <w:tcBorders>
-              <w:top w:val="single" w:color="BFBFBF" w:themeColor="background1" w:themeShade="BF" w:sz="6" w:space="0"/>
-              <w:left w:val="single" w:color="BFBFBF" w:themeColor="background1" w:themeShade="BF" w:sz="6" w:space="0"/>
-              <w:bottom w:val="single" w:color="BFBFBF" w:themeColor="background1" w:themeShade="BF" w:sz="6" w:space="0"/>
-              <w:right w:val="single" w:color="BFBFBF" w:themeColor="background1" w:themeShade="BF" w:sz="6" w:space="0"/>
+              <w:top w:val="single" w:sz="6" w:space="0" w:color="BFBFBF" w:themeColor="background1" w:themeShade="BF"/>
+              <w:left w:val="single" w:sz="6" w:space="0" w:color="BFBFBF" w:themeColor="background1" w:themeShade="BF"/>
+              <w:bottom w:val="single" w:sz="6" w:space="0" w:color="BFBFBF" w:themeColor="background1" w:themeShade="BF"/>
+              <w:right w:val="single" w:sz="6" w:space="0" w:color="BFBFBF" w:themeColor="background1" w:themeShade="BF"/>
             </w:tcBorders>
-            <w:tcMar/>
           </w:tcPr>
           <w:p>
             <w:r>
-              <w:t xml:space="preserve">A figurine inventory table with a header row and five data rows across four columns: Figurine, Series, Condition, and Value. Six rows and four columns total, exceeding the three-by-three minimum.</w:t>
+              <w:t>A figurine inventory table with a header row and five data rows across four columns: Figurine, Series, Condition, and Value. Six rows and four columns total, exceeding the three-by-three minimum.</w:t>
             </w:r>
           </w:p>
         </w:tc>
@@ -266,16 +255,15 @@
           <w:tcPr>
             <w:tcW w:w="3360" w:type="dxa"/>
             <w:tcBorders>
-              <w:top w:val="single" w:color="BFBFBF" w:themeColor="background1" w:themeShade="BF" w:sz="6" w:space="0"/>
-              <w:left w:val="single" w:color="BFBFBF" w:themeColor="background1" w:themeShade="BF" w:sz="6" w:space="0"/>
-              <w:bottom w:val="single" w:color="BFBFBF" w:themeColor="background1" w:themeShade="BF" w:sz="6" w:space="0"/>
-              <w:right w:val="single" w:color="BFBFBF" w:themeColor="background1" w:themeShade="BF" w:sz="6" w:space="0"/>
+              <w:top w:val="single" w:sz="6" w:space="0" w:color="BFBFBF" w:themeColor="background1" w:themeShade="BF"/>
+              <w:left w:val="single" w:sz="6" w:space="0" w:color="BFBFBF" w:themeColor="background1" w:themeShade="BF"/>
+              <w:bottom w:val="single" w:sz="6" w:space="0" w:color="BFBFBF" w:themeColor="background1" w:themeShade="BF"/>
+              <w:right w:val="single" w:sz="6" w:space="0" w:color="BFBFBF" w:themeColor="background1" w:themeShade="BF"/>
             </w:tcBorders>
-            <w:tcMar/>
           </w:tcPr>
           <w:p>
             <w:r>
-              <w:t xml:space="preserve">Inside the Current Inventory &lt;section&gt;, lines 92-129.</w:t>
+              <w:t>lines 92-129.</w:t>
             </w:r>
           </w:p>
         </w:tc>
@@ -288,17 +276,25 @@
           <w:tcPr>
             <w:tcW w:w="3360" w:type="dxa"/>
             <w:tcBorders>
-              <w:top w:val="single" w:color="BFBFBF" w:themeColor="background1" w:themeShade="BF" w:sz="6" w:space="0"/>
-              <w:left w:val="single" w:color="BFBFBF" w:themeColor="background1" w:themeShade="BF" w:sz="6" w:space="0"/>
-              <w:bottom w:val="single" w:color="BFBFBF" w:themeColor="background1" w:themeShade="BF" w:sz="6" w:space="0"/>
-              <w:right w:val="single" w:color="BFBFBF" w:themeColor="background1" w:themeShade="BF" w:sz="6" w:space="0"/>
+              <w:top w:val="single" w:sz="6" w:space="0" w:color="BFBFBF" w:themeColor="background1" w:themeShade="BF"/>
+              <w:left w:val="single" w:sz="6" w:space="0" w:color="BFBFBF" w:themeColor="background1" w:themeShade="BF"/>
+              <w:bottom w:val="single" w:sz="6" w:space="0" w:color="BFBFBF" w:themeColor="background1" w:themeShade="BF"/>
+              <w:right w:val="single" w:sz="6" w:space="0" w:color="BFBFBF" w:themeColor="background1" w:themeShade="BF"/>
             </w:tcBorders>
-            <w:tcMar/>
             <w:hideMark/>
           </w:tcPr>
           <w:p>
             <w:r>
-              <w:t xml:space="preserve">Internal stylesheet with box model properties on at least three elements</w:t>
+              <w:lastRenderedPageBreak/>
+              <w:t xml:space="preserve">Internal </w:t>
+            </w:r>
+            <w:proofErr w:type="gramStart"/>
+            <w:r>
+              <w:t>stylesheet</w:t>
+            </w:r>
+            <w:proofErr w:type="gramEnd"/>
+            <w:r>
+              <w:t xml:space="preserve"> with box model properties on at least three elements</w:t>
             </w:r>
           </w:p>
         </w:tc>
@@ -306,16 +302,23 @@
           <w:tcPr>
             <w:tcW w:w="3360" w:type="dxa"/>
             <w:tcBorders>
-              <w:top w:val="single" w:color="BFBFBF" w:themeColor="background1" w:themeShade="BF" w:sz="6" w:space="0"/>
-              <w:left w:val="single" w:color="BFBFBF" w:themeColor="background1" w:themeShade="BF" w:sz="6" w:space="0"/>
-              <w:bottom w:val="single" w:color="BFBFBF" w:themeColor="background1" w:themeShade="BF" w:sz="6" w:space="0"/>
-              <w:right w:val="single" w:color="BFBFBF" w:themeColor="background1" w:themeShade="BF" w:sz="6" w:space="0"/>
+              <w:top w:val="single" w:sz="6" w:space="0" w:color="BFBFBF" w:themeColor="background1" w:themeShade="BF"/>
+              <w:left w:val="single" w:sz="6" w:space="0" w:color="BFBFBF" w:themeColor="background1" w:themeShade="BF"/>
+              <w:bottom w:val="single" w:sz="6" w:space="0" w:color="BFBFBF" w:themeColor="background1" w:themeShade="BF"/>
+              <w:right w:val="single" w:sz="6" w:space="0" w:color="BFBFBF" w:themeColor="background1" w:themeShade="BF"/>
             </w:tcBorders>
-            <w:tcMar/>
           </w:tcPr>
           <w:p>
             <w:r>
-              <w:t xml:space="preserve">An internal &lt;style&gt; block that sets box model properties on seven selectors: body (width, margin, padding), header (padding, border-bottom, margin-bottom), nav (padding, margin-bottom), section (border, padding, margin-bottom), table (width, margin-top), th and td (border, padding), and aside (width, border-left, padding, margin).</w:t>
+              <w:t xml:space="preserve">An internal &lt;style&gt; block that sets box model properties on seven selectors: body (width, margin, padding), header (padding, border-bottom, margin-bottom), nav (padding, margin-bottom), section (border, padding, margin-bottom), table (width, margin-top), </w:t>
+            </w:r>
+            <w:proofErr w:type="spellStart"/>
+            <w:r>
+              <w:t>th</w:t>
+            </w:r>
+            <w:proofErr w:type="spellEnd"/>
+            <w:r>
+              <w:t xml:space="preserve"> and td (border, padding), and aside (width, border-left, padding, margin).</w:t>
             </w:r>
           </w:p>
         </w:tc>
@@ -323,16 +326,18 @@
           <w:tcPr>
             <w:tcW w:w="3360" w:type="dxa"/>
             <w:tcBorders>
-              <w:top w:val="single" w:color="BFBFBF" w:themeColor="background1" w:themeShade="BF" w:sz="6" w:space="0"/>
-              <w:left w:val="single" w:color="BFBFBF" w:themeColor="background1" w:themeShade="BF" w:sz="6" w:space="0"/>
-              <w:bottom w:val="single" w:color="BFBFBF" w:themeColor="background1" w:themeShade="BF" w:sz="6" w:space="0"/>
-              <w:right w:val="single" w:color="BFBFBF" w:themeColor="background1" w:themeShade="BF" w:sz="6" w:space="0"/>
+              <w:top w:val="single" w:sz="6" w:space="0" w:color="BFBFBF" w:themeColor="background1" w:themeShade="BF"/>
+              <w:left w:val="single" w:sz="6" w:space="0" w:color="BFBFBF" w:themeColor="background1" w:themeShade="BF"/>
+              <w:bottom w:val="single" w:sz="6" w:space="0" w:color="BFBFBF" w:themeColor="background1" w:themeShade="BF"/>
+              <w:right w:val="single" w:sz="6" w:space="0" w:color="BFBFBF" w:themeColor="background1" w:themeShade="BF"/>
             </w:tcBorders>
-            <w:tcMar/>
           </w:tcPr>
           <w:p>
             <w:r>
-              <w:t xml:space="preserve">In the &lt;head&gt;, lines 14-73.</w:t>
+              <w:t xml:space="preserve">Line </w:t>
+            </w:r>
+            <w:r>
+              <w:t>14-73.</w:t>
             </w:r>
           </w:p>
         </w:tc>
@@ -345,12 +350,11 @@
           <w:tcPr>
             <w:tcW w:w="3360" w:type="dxa"/>
             <w:tcBorders>
-              <w:top w:val="single" w:color="BFBFBF" w:themeColor="background1" w:themeShade="BF" w:sz="6" w:space="0"/>
-              <w:left w:val="single" w:color="BFBFBF" w:themeColor="background1" w:themeShade="BF" w:sz="6" w:space="0"/>
-              <w:bottom w:val="single" w:color="BFBFBF" w:themeColor="background1" w:themeShade="BF" w:sz="6" w:space="0"/>
-              <w:right w:val="single" w:color="BFBFBF" w:themeColor="background1" w:themeShade="BF" w:sz="6" w:space="0"/>
+              <w:top w:val="single" w:sz="6" w:space="0" w:color="BFBFBF" w:themeColor="background1" w:themeShade="BF"/>
+              <w:left w:val="single" w:sz="6" w:space="0" w:color="BFBFBF" w:themeColor="background1" w:themeShade="BF"/>
+              <w:bottom w:val="single" w:sz="6" w:space="0" w:color="BFBFBF" w:themeColor="background1" w:themeShade="BF"/>
+              <w:right w:val="single" w:sz="6" w:space="0" w:color="BFBFBF" w:themeColor="background1" w:themeShade="BF"/>
             </w:tcBorders>
-            <w:tcMar/>
             <w:hideMark/>
           </w:tcPr>
           <w:p>
@@ -363,16 +367,23 @@
           <w:tcPr>
             <w:tcW w:w="3360" w:type="dxa"/>
             <w:tcBorders>
-              <w:top w:val="single" w:color="BFBFBF" w:themeColor="background1" w:themeShade="BF" w:sz="6" w:space="0"/>
-              <w:left w:val="single" w:color="BFBFBF" w:themeColor="background1" w:themeShade="BF" w:sz="6" w:space="0"/>
-              <w:bottom w:val="single" w:color="BFBFBF" w:themeColor="background1" w:themeShade="BF" w:sz="6" w:space="0"/>
-              <w:right w:val="single" w:color="BFBFBF" w:themeColor="background1" w:themeShade="BF" w:sz="6" w:space="0"/>
+              <w:top w:val="single" w:sz="6" w:space="0" w:color="BFBFBF" w:themeColor="background1" w:themeShade="BF"/>
+              <w:left w:val="single" w:sz="6" w:space="0" w:color="BFBFBF" w:themeColor="background1" w:themeShade="BF"/>
+              <w:bottom w:val="single" w:sz="6" w:space="0" w:color="BFBFBF" w:themeColor="background1" w:themeShade="BF"/>
+              <w:right w:val="single" w:sz="6" w:space="0" w:color="BFBFBF" w:themeColor="background1" w:themeShade="BF"/>
             </w:tcBorders>
-            <w:tcMar/>
           </w:tcPr>
           <w:p>
             <w:r>
-              <w:t xml:space="preserve">Inline style attributes on two footer elements: the &lt;footer&gt; itself (margin-top, padding, border-top, background-color) and the &lt;p&gt; inside it (margin, padding).</w:t>
+              <w:t xml:space="preserve">Inline style attributes on </w:t>
+            </w:r>
+            <w:proofErr w:type="gramStart"/>
+            <w:r>
+              <w:t>two footer</w:t>
+            </w:r>
+            <w:proofErr w:type="gramEnd"/>
+            <w:r>
+              <w:t xml:space="preserve"> elements: the &lt;footer&gt; itself (margin-top, padding, border-top, background-color) and the &lt;p&gt; inside it (margin, padding).</w:t>
             </w:r>
           </w:p>
         </w:tc>
@@ -380,16 +391,21 @@
           <w:tcPr>
             <w:tcW w:w="3360" w:type="dxa"/>
             <w:tcBorders>
-              <w:top w:val="single" w:color="BFBFBF" w:themeColor="background1" w:themeShade="BF" w:sz="6" w:space="0"/>
-              <w:left w:val="single" w:color="BFBFBF" w:themeColor="background1" w:themeShade="BF" w:sz="6" w:space="0"/>
-              <w:bottom w:val="single" w:color="BFBFBF" w:themeColor="background1" w:themeShade="BF" w:sz="6" w:space="0"/>
-              <w:right w:val="single" w:color="BFBFBF" w:themeColor="background1" w:themeShade="BF" w:sz="6" w:space="0"/>
+              <w:top w:val="single" w:sz="6" w:space="0" w:color="BFBFBF" w:themeColor="background1" w:themeShade="BF"/>
+              <w:left w:val="single" w:sz="6" w:space="0" w:color="BFBFBF" w:themeColor="background1" w:themeShade="BF"/>
+              <w:bottom w:val="single" w:sz="6" w:space="0" w:color="BFBFBF" w:themeColor="background1" w:themeShade="BF"/>
+              <w:right w:val="single" w:sz="6" w:space="0" w:color="BFBFBF" w:themeColor="background1" w:themeShade="BF"/>
             </w:tcBorders>
-            <w:tcMar/>
           </w:tcPr>
           <w:p>
             <w:r>
-              <w:t xml:space="preserve">&lt;footer&gt; line 154 and its &lt;p&gt; line 155.</w:t>
+              <w:t xml:space="preserve">Line </w:t>
+            </w:r>
+            <w:r>
+              <w:t xml:space="preserve">154 and </w:t>
+            </w:r>
+            <w:r>
+              <w:t>155.</w:t>
             </w:r>
           </w:p>
         </w:tc>
@@ -398,60 +414,22 @@
     <w:p>
       <w:pPr>
         <w:pStyle w:val="Heading1"/>
-        <w:keepNext w:val="1"/>
-        <w:keepLines w:val="1"/>
-        <w:spacing w:before="240" w:after="120" w:line="259" w:lineRule="auto"/>
         <w:rPr>
-          <w:rFonts w:ascii="Calibri Light" w:hAnsi="Calibri Light" w:eastAsia="Calibri Light" w:cs="Calibri Light"/>
-          <w:b w:val="0"/>
-          <w:bCs w:val="0"/>
-          <w:i w:val="0"/>
-          <w:iCs w:val="0"/>
-          <w:caps w:val="0"/>
-          <w:smallCaps w:val="0"/>
-          <w:noProof w:val="0"/>
-          <w:color w:val="2F5496" w:themeColor="accent1" w:themeTint="FF" w:themeShade="BF"/>
-          <w:sz w:val="32"/>
-          <w:szCs w:val="32"/>
-          <w:lang w:val="en-US"/>
+          <w:rFonts w:ascii="Calibri Light" w:eastAsia="Calibri Light" w:hAnsi="Calibri Light" w:cs="Calibri Light"/>
         </w:rPr>
       </w:pPr>
       <w:r>
         <w:rPr>
-          <w:rFonts w:ascii="Calibri Light" w:hAnsi="Calibri Light" w:eastAsia="Calibri Light" w:cs="Calibri Light"/>
-          <w:b w:val="0"/>
-          <w:bCs w:val="0"/>
-          <w:i w:val="0"/>
-          <w:iCs w:val="0"/>
-          <w:caps w:val="0"/>
-          <w:smallCaps w:val="0"/>
-          <w:noProof w:val="0"/>
-          <w:color w:val="2F5496" w:themeColor="accent1" w:themeTint="FF" w:themeShade="BF"/>
-          <w:sz w:val="32"/>
-          <w:szCs w:val="32"/>
-          <w:lang w:val="en-US"/>
+          <w:rFonts w:ascii="Calibri Light" w:eastAsia="Calibri Light" w:hAnsi="Calibri Light" w:cs="Calibri Light"/>
         </w:rPr>
         <w:t xml:space="preserve">Code Evidence </w:t>
       </w:r>
     </w:p>
     <w:p>
-      <w:pPr>
-        <w:pStyle w:val="Normal"/>
-      </w:pPr>
       <w:r>
         <w:rPr>
-          <w:rFonts w:ascii="Calibri" w:hAnsi="Calibri" w:eastAsia="Calibri" w:cs="Calibri"/>
-          <w:b w:val="0"/>
-          <w:bCs w:val="0"/>
-          <w:i w:val="0"/>
-          <w:iCs w:val="0"/>
-          <w:caps w:val="0"/>
-          <w:smallCaps w:val="0"/>
-          <w:noProof w:val="0"/>
-          <w:color w:val="000000" w:themeColor="text1" w:themeTint="FF" w:themeShade="FF"/>
-          <w:sz w:val="22"/>
-          <w:szCs w:val="22"/>
-          <w:lang w:val="en-US"/>
+          <w:rFonts w:eastAsia="Calibri" w:cs="Calibri"/>
+          <w:color w:val="000000" w:themeColor="text1"/>
         </w:rPr>
         <w:t>Insert screenshots that show the completed code for this assignment. Make sure your screenshots are legible and contain the computer system date and time.</w:t>
       </w:r>
@@ -461,7 +439,6 @@
         <w:pStyle w:val="Heading2"/>
       </w:pPr>
       <w:r>
-        <w:lastRenderedPageBreak/>
         <w:t xml:space="preserve">Screenshot 1: </w:t>
       </w:r>
       <w:r>
@@ -476,14 +453,53 @@
         <w:t>Insert a screenshot showing your added semantic HTML elements and figurine inventory table.</w:t>
       </w:r>
     </w:p>
-    <w:p/>
+    <w:p>
+      <w:r>
+        <w:lastRenderedPageBreak/>
+        <w:drawing>
+          <wp:inline distT="0" distB="0" distL="0" distR="0" wp14:anchorId="3BC224A2" wp14:editId="22042C4D">
+            <wp:extent cx="5103495" cy="8229600"/>
+            <wp:effectExtent l="0" t="0" r="1905" b="0"/>
+            <wp:docPr id="1416711131" name="Picture 1"/>
+            <wp:cNvGraphicFramePr>
+              <a:graphicFrameLocks xmlns:a="http://schemas.openxmlformats.org/drawingml/2006/main" noChangeAspect="1"/>
+            </wp:cNvGraphicFramePr>
+            <a:graphic xmlns:a="http://schemas.openxmlformats.org/drawingml/2006/main">
+              <a:graphicData uri="http://schemas.openxmlformats.org/drawingml/2006/picture">
+                <pic:pic xmlns:pic="http://schemas.openxmlformats.org/drawingml/2006/picture">
+                  <pic:nvPicPr>
+                    <pic:cNvPr id="1416711131" name=""/>
+                    <pic:cNvPicPr/>
+                  </pic:nvPicPr>
+                  <pic:blipFill>
+                    <a:blip r:embed="rId10"/>
+                    <a:stretch>
+                      <a:fillRect/>
+                    </a:stretch>
+                  </pic:blipFill>
+                  <pic:spPr>
+                    <a:xfrm>
+                      <a:off x="0" y="0"/>
+                      <a:ext cx="5103495" cy="8229600"/>
+                    </a:xfrm>
+                    <a:prstGeom prst="rect">
+                      <a:avLst/>
+                    </a:prstGeom>
+                  </pic:spPr>
+                </pic:pic>
+              </a:graphicData>
+            </a:graphic>
+          </wp:inline>
+        </w:drawing>
+      </w:r>
+    </w:p>
     <w:p/>
     <w:p>
       <w:pPr>
         <w:pStyle w:val="Heading2"/>
       </w:pPr>
       <w:r>
-        <w:t xml:space="preserve">Screenshot 2: Internal CSS and Inline Footer Styles</w:t>
+        <w:t>Screenshot 2: Internal CSS and Inline Footer Styles</w:t>
       </w:r>
     </w:p>
     <w:p>
@@ -505,27 +521,130 @@
           <w:i/>
         </w:rPr>
       </w:pPr>
+      <w:r>
+        <w:rPr>
+          <w:i/>
+        </w:rPr>
+        <w:drawing>
+          <wp:inline distT="0" distB="0" distL="0" distR="0" wp14:anchorId="7D483D9F" wp14:editId="1BE862B7">
+            <wp:extent cx="5852160" cy="3905250"/>
+            <wp:effectExtent l="0" t="0" r="0" b="0"/>
+            <wp:docPr id="596399005" name="Picture 1"/>
+            <wp:cNvGraphicFramePr>
+              <a:graphicFrameLocks xmlns:a="http://schemas.openxmlformats.org/drawingml/2006/main" noChangeAspect="1"/>
+            </wp:cNvGraphicFramePr>
+            <a:graphic xmlns:a="http://schemas.openxmlformats.org/drawingml/2006/main">
+              <a:graphicData uri="http://schemas.openxmlformats.org/drawingml/2006/picture">
+                <pic:pic xmlns:pic="http://schemas.openxmlformats.org/drawingml/2006/picture">
+                  <pic:nvPicPr>
+                    <pic:cNvPr id="596399005" name=""/>
+                    <pic:cNvPicPr/>
+                  </pic:nvPicPr>
+                  <pic:blipFill>
+                    <a:blip r:embed="rId11"/>
+                    <a:stretch>
+                      <a:fillRect/>
+                    </a:stretch>
+                  </pic:blipFill>
+                  <pic:spPr>
+                    <a:xfrm>
+                      <a:off x="0" y="0"/>
+                      <a:ext cx="5852160" cy="3905250"/>
+                    </a:xfrm>
+                    <a:prstGeom prst="rect">
+                      <a:avLst/>
+                    </a:prstGeom>
+                  </pic:spPr>
+                </pic:pic>
+              </a:graphicData>
+            </a:graphic>
+          </wp:inline>
+        </w:drawing>
+      </w:r>
     </w:p>
     <w:p>
       <w:pPr>
-        <w:pStyle w:val="Normal"/>
         <w:rPr>
-          <w:i w:val="1"/>
-          <w:iCs w:val="1"/>
+          <w:i/>
         </w:rPr>
       </w:pPr>
     </w:p>
     <w:p>
       <w:pPr>
+        <w:rPr>
+          <w:i/>
+        </w:rPr>
+      </w:pPr>
+    </w:p>
+    <w:p>
+      <w:pPr>
+        <w:rPr>
+          <w:i/>
+        </w:rPr>
+      </w:pPr>
+    </w:p>
+    <w:p>
+      <w:pPr>
+        <w:rPr>
+          <w:i/>
+        </w:rPr>
+      </w:pPr>
+    </w:p>
+    <w:p>
+      <w:pPr>
+        <w:rPr>
+          <w:i/>
+        </w:rPr>
+      </w:pPr>
+    </w:p>
+    <w:p>
+      <w:pPr>
+        <w:rPr>
+          <w:i/>
+        </w:rPr>
+      </w:pPr>
+    </w:p>
+    <w:p>
+      <w:pPr>
+        <w:rPr>
+          <w:i/>
+        </w:rPr>
+      </w:pPr>
+    </w:p>
+    <w:p>
+      <w:pPr>
+        <w:rPr>
+          <w:i/>
+        </w:rPr>
+      </w:pPr>
+    </w:p>
+    <w:p>
+      <w:pPr>
+        <w:rPr>
+          <w:i/>
+        </w:rPr>
+      </w:pPr>
+    </w:p>
+    <w:p>
+      <w:pPr>
+        <w:rPr>
+          <w:i/>
+          <w:iCs/>
+        </w:rPr>
+      </w:pPr>
+    </w:p>
+    <w:p>
+      <w:pPr>
         <w:pStyle w:val="Heading1"/>
       </w:pPr>
       <w:r>
+        <w:lastRenderedPageBreak/>
         <w:t>Rendered Web Page Evidence</w:t>
       </w:r>
     </w:p>
     <w:p>
       <w:r>
-        <w:t xml:space="preserve">Insert a screenshot of the completed web page as it appears in your browser. The page should be logically structured, visually organized, and free of visible stray tags.</w:t>
+        <w:t>Insert a screenshot of the completed web page as it appears in your browser. The page should be logically structured, visually organized, and free of visible stray tags.</w:t>
       </w:r>
     </w:p>
     <w:p>
@@ -543,21 +662,49 @@
       </w:r>
     </w:p>
     <w:p>
-      <w:pPr>
-        <w:rPr>
-          <w:i w:val="0"/>
-          <w:iCs w:val="0"/>
-        </w:rPr>
-      </w:pPr>
       <w:r>
-        <w:rPr>
-          <w:i w:val="0"/>
-          <w:iCs w:val="0"/>
-        </w:rPr>
-        <w:t xml:space="preserve">Insert a screenshot of the completed Box Model Inventory page in the browser.</w:t>
+        <w:t>Insert a screenshot of the completed Box Model Inventory page in the browser.</w:t>
       </w:r>
     </w:p>
-    <w:p/>
+    <w:p>
+      <w:r>
+        <w:drawing>
+          <wp:inline distT="0" distB="0" distL="0" distR="0" wp14:anchorId="7D7F5404" wp14:editId="0A86DEBB">
+            <wp:extent cx="5852160" cy="2753360"/>
+            <wp:effectExtent l="0" t="0" r="0" b="8890"/>
+            <wp:docPr id="604858443" name="Picture 1"/>
+            <wp:cNvGraphicFramePr>
+              <a:graphicFrameLocks xmlns:a="http://schemas.openxmlformats.org/drawingml/2006/main" noChangeAspect="1"/>
+            </wp:cNvGraphicFramePr>
+            <a:graphic xmlns:a="http://schemas.openxmlformats.org/drawingml/2006/main">
+              <a:graphicData uri="http://schemas.openxmlformats.org/drawingml/2006/picture">
+                <pic:pic xmlns:pic="http://schemas.openxmlformats.org/drawingml/2006/picture">
+                  <pic:nvPicPr>
+                    <pic:cNvPr id="604858443" name=""/>
+                    <pic:cNvPicPr/>
+                  </pic:nvPicPr>
+                  <pic:blipFill>
+                    <a:blip r:embed="rId12"/>
+                    <a:stretch>
+                      <a:fillRect/>
+                    </a:stretch>
+                  </pic:blipFill>
+                  <pic:spPr>
+                    <a:xfrm>
+                      <a:off x="0" y="0"/>
+                      <a:ext cx="5852160" cy="2753360"/>
+                    </a:xfrm>
+                    <a:prstGeom prst="rect">
+                      <a:avLst/>
+                    </a:prstGeom>
+                  </pic:spPr>
+                </pic:pic>
+              </a:graphicData>
+            </a:graphic>
+          </wp:inline>
+        </w:drawing>
+      </w:r>
+    </w:p>
     <w:p/>
     <w:p>
       <w:pPr>
@@ -581,18 +728,18 @@
         </w:numPr>
         <w:rPr>
           <w:rFonts w:ascii="Aptos" w:hAnsi="Aptos"/>
-          <w:b w:val="1"/>
-          <w:bCs w:val="1"/>
+          <w:b/>
+          <w:bCs/>
           <w:sz w:val="21"/>
           <w:szCs w:val="21"/>
         </w:rPr>
       </w:pPr>
       <w:r>
         <w:rPr>
-          <w:b w:val="1"/>
-          <w:bCs w:val="1"/>
+          <w:b/>
+          <w:bCs/>
         </w:rPr>
-        <w:t xml:space="preserve">What semantic HTML elements could you add to further organize the page?</w:t>
+        <w:t>What semantic HTML elements could you add to further organize the page?</w:t>
       </w:r>
     </w:p>
     <w:p>
@@ -600,7 +747,22 @@
         <w:ind w:left="720"/>
       </w:pPr>
       <w:r>
-        <w:t xml:space="preserve">The table itself could use &lt;thead&gt;, &lt;tbody&gt;, and &lt;tfoot&gt; to separate the header row from the data rows and to hold a row totaling the collection's value. A &lt;figure&gt; with a &lt;figcaption&gt; would let each figurine be paired with a photo and a caption, and a &lt;time&gt; element could record the date each piece was acquired in a machine-readable format. If the inventory grew large enough to split across pages, each entry could become its own &lt;article&gt; so it could be moved or reused independently.</w:t>
+        <w:t xml:space="preserve">The </w:t>
+      </w:r>
+      <w:r>
+        <w:t xml:space="preserve">title </w:t>
+      </w:r>
+      <w:r>
+        <w:t>Figurine Inventory</w:t>
+      </w:r>
+      <w:r>
+        <w:t xml:space="preserve"> could be in its own </w:t>
+      </w:r>
+      <w:r>
+        <w:t>panel</w:t>
+      </w:r>
+      <w:r>
+        <w:t xml:space="preserve">. </w:t>
       </w:r>
     </w:p>
     <w:p/>
@@ -612,16 +774,16 @@
           <w:numId w:val="29"/>
         </w:numPr>
         <w:rPr>
-          <w:b w:val="1"/>
-          <w:bCs w:val="1"/>
+          <w:b/>
+          <w:bCs/>
         </w:rPr>
       </w:pPr>
       <w:r>
         <w:rPr>
-          <w:b w:val="1"/>
-          <w:bCs w:val="1"/>
+          <w:b/>
+          <w:bCs/>
         </w:rPr>
-        <w:t xml:space="preserve">What box model properties could you include, and how would it improve the layout or readability of the page?</w:t>
+        <w:t>What box model properties could you include, and how would it improve the layout or readability of the page?</w:t>
       </w:r>
     </w:p>
     <w:p>
@@ -629,15 +791,46 @@
         <w:ind w:left="720"/>
       </w:pPr>
       <w:r>
-        <w:t xml:space="preserve">I could increase the padding inside the table cells so the rows are easier to scan, and increase the margin between sections so the groups separate more clearly at a glance. Adding box-sizing: border-box would help the most, because it makes an element's stated width include its padding and border, so boxes stay the size I set instead of growing wider than expected. Replacing the body's fixed width with a max-width would keep line length readable on smaller screens, and matching border-radius values on the sections, aside, and footer would make the blocks look like one consistent system.</w:t>
+        <w:t xml:space="preserve">could improve the layout by adding more padding to the </w:t>
+      </w:r>
+      <w:proofErr w:type="gramStart"/>
+      <w:r>
+        <w:t>table cells</w:t>
+      </w:r>
+      <w:proofErr w:type="gramEnd"/>
+      <w:r>
+        <w:t xml:space="preserve"> and more space between sections. Using box-sizing: border-box, max-width, and matching rounded corners would also keep the page responsive and visually consistent.</w:t>
       </w:r>
     </w:p>
     <w:p>
       <w:pPr>
-        <w:pStyle w:val="Normal"/>
         <w:rPr>
-          <w:b w:val="1"/>
-          <w:bCs w:val="1"/>
+          <w:b/>
+          <w:bCs/>
+        </w:rPr>
+      </w:pPr>
+    </w:p>
+    <w:p>
+      <w:pPr>
+        <w:rPr>
+          <w:b/>
+          <w:bCs/>
+        </w:rPr>
+      </w:pPr>
+    </w:p>
+    <w:p>
+      <w:pPr>
+        <w:rPr>
+          <w:b/>
+          <w:bCs/>
+        </w:rPr>
+      </w:pPr>
+    </w:p>
+    <w:p>
+      <w:pPr>
+        <w:rPr>
+          <w:b/>
+          <w:bCs/>
         </w:rPr>
       </w:pPr>
     </w:p>
@@ -649,15 +842,16 @@
           <w:numId w:val="29"/>
         </w:numPr>
         <w:rPr>
-          <w:b w:val="1"/>
-          <w:bCs w:val="1"/>
+          <w:b/>
+          <w:bCs/>
         </w:rPr>
       </w:pPr>
       <w:r>
         <w:rPr>
-          <w:b w:val="1"/>
-          <w:bCs w:val="1"/>
+          <w:b/>
+          <w:bCs/>
         </w:rPr>
+        <w:lastRenderedPageBreak/>
         <w:t>What is one change you would make if you continued improving this inventory page?</w:t>
       </w:r>
     </w:p>
@@ -665,14 +859,38 @@
       <w:pPr>
         <w:ind w:left="720"/>
       </w:pPr>
+      <w:proofErr w:type="gramStart"/>
       <w:r>
-        <w:t xml:space="preserve">The change I would make first is moving the internal stylesheet into an external .css file. Right now the styling only applies to this one page, so if I added a second inventory page I would have to copy every rule into it. An external file would let both pages link to the same styles and would keep the HTML focused on structure. For the same reason I would replace the two inline footer styles with a class defined in that stylesheet, since inline styles have to be edited element by element and are the hardest to keep consistent.</w:t>
+        <w:t xml:space="preserve">A </w:t>
+      </w:r>
+      <w:r>
+        <w:t>change I would make</w:t>
+      </w:r>
+      <w:proofErr w:type="gramEnd"/>
+      <w:r>
+        <w:t xml:space="preserve"> </w:t>
+      </w:r>
+      <w:proofErr w:type="gramStart"/>
+      <w:r>
+        <w:t>is moving</w:t>
+      </w:r>
+      <w:proofErr w:type="gramEnd"/>
+      <w:r>
+        <w:t xml:space="preserve"> the internal CSS into an external </w:t>
+      </w:r>
+      <w:proofErr w:type="gramStart"/>
+      <w:r>
+        <w:t>stylesheet</w:t>
+      </w:r>
+      <w:proofErr w:type="gramEnd"/>
+      <w:r>
+        <w:t>. This would allow multiple pages to share the same design and keep the HTML cleaner. I would also replace the inline footer styles with a CSS class to make updates easier and more consistent.</w:t>
       </w:r>
     </w:p>
     <w:sectPr>
-      <w:headerReference w:type="default" r:id="rId10"/>
-      <w:footerReference w:type="default" r:id="rId11"/>
-      <w:pgSz w:w="12240" w:h="15840" w:orient="portrait" w:code="1"/>
+      <w:headerReference w:type="default" r:id="rId13"/>
+      <w:footerReference w:type="default" r:id="rId14"/>
+      <w:pgSz w:w="12240" w:h="15840" w:code="1"/>
       <w:pgMar w:top="1440" w:right="1440" w:bottom="1440" w:left="1440" w:header="1440" w:footer="1440" w:gutter="144"/>
       <w:cols w:space="720"/>
       <w:docGrid w:linePitch="360"/>
@@ -682,7 +900,7 @@
 </file>
 
 <file path=word/endnotes.xml><?xml version="1.0" encoding="utf-8"?>
-<w:endnotes xmlns:wpc="http://schemas.microsoft.com/office/word/2010/wordprocessingCanvas" xmlns:cx="http://schemas.microsoft.com/office/drawing/2014/chartex" xmlns:cx1="http://schemas.microsoft.com/office/drawing/2015/9/8/chartex" xmlns:cx2="http://schemas.microsoft.com/office/drawing/2015/10/21/chartex" xmlns:cx3="http://schemas.microsoft.com/office/drawing/2016/5/9/chartex" xmlns:cx4="http://schemas.microsoft.com/office/drawing/2016/5/10/chartex" xmlns:cx5="http://schemas.microsoft.com/office/drawing/2016/5/11/chartex" xmlns:cx6="http://schemas.microsoft.com/office/drawing/2016/5/12/chartex" xmlns:cx7="http://schemas.microsoft.com/office/drawing/2016/5/13/chartex" xmlns:cx8="http://schemas.microsoft.com/office/drawing/2016/5/14/chartex" xmlns:mc="http://schemas.openxmlformats.org/markup-compatibility/2006" xmlns:aink="http://schemas.microsoft.com/office/drawing/2016/ink" xmlns:am3d="http://schemas.microsoft.com/office/drawing/2017/model3d" xmlns:o="urn:schemas-microsoft-com:office:office" xmlns:oel="http://schemas.microsoft.com/office/2019/extlst" xmlns:r="http://schemas.openxmlformats.org/officeDocument/2006/relationships" xmlns:m="http://schemas.openxmlformats.org/officeDocument/2006/math" xmlns:v="urn:schemas-microsoft-com:vml" xmlns:wp14="http://schemas.microsoft.com/office/word/2010/wordprocessingDrawing" xmlns:wp="http://schemas.openxmlformats.org/drawingml/2006/wordprocessingDrawing" xmlns:w10="urn:schemas-microsoft-com:office:word" xmlns:w="http://schemas.openxmlformats.org/wordprocessingml/2006/main" xmlns:w14="http://schemas.microsoft.com/office/word/2010/wordml" xmlns:w15="http://schemas.microsoft.com/office/word/2012/wordml" xmlns:w16cex="http://schemas.microsoft.com/office/word/2018/wordml/cex" xmlns:w16cid="http://schemas.microsoft.com/office/word/2016/wordml/cid" xmlns:w16="http://schemas.microsoft.com/office/word/2018/wordml" xmlns:w16du="http://schemas.microsoft.com/office/word/2023/wordml/word16du" xmlns:w16sdtdh="http://schemas.microsoft.com/office/word/2020/wordml/sdtdatahash" xmlns:w16sdtfl="http://schemas.microsoft.com/office/word/2024/wordml/sdtformatlock" xmlns:w16se="http://schemas.microsoft.com/office/word/2015/wordml/symex" xmlns:wpg="http://schemas.microsoft.com/office/word/2010/wordprocessingGroup" xmlns:wpi="http://schemas.microsoft.com/office/word/2010/wordprocessingInk" xmlns:wne="http://schemas.microsoft.com/office/word/2006/wordml" xmlns:wps="http://schemas.microsoft.com/office/word/2010/wordprocessingShape" mc:Ignorable="w14 w15 w16se w16cid w16 w16cex w16sdtdh w16sdtfl w16du wp14">
+<w:endnotes xmlns:wpc="http://schemas.microsoft.com/office/word/2010/wordprocessingCanvas" xmlns:cx="http://schemas.microsoft.com/office/drawing/2014/chartex" xmlns:cx1="http://schemas.microsoft.com/office/drawing/2015/9/8/chartex" xmlns:cx2="http://schemas.microsoft.com/office/drawing/2015/10/21/chartex" xmlns:cx3="http://schemas.microsoft.com/office/drawing/2016/5/9/chartex" xmlns:cx4="http://schemas.microsoft.com/office/drawing/2016/5/10/chartex" xmlns:cx5="http://schemas.microsoft.com/office/drawing/2016/5/11/chartex" xmlns:cx6="http://schemas.microsoft.com/office/drawing/2016/5/12/chartex" xmlns:cx7="http://schemas.microsoft.com/office/drawing/2016/5/13/chartex" xmlns:cx8="http://schemas.microsoft.com/office/drawing/2016/5/14/chartex" xmlns:mc="http://schemas.openxmlformats.org/markup-compatibility/2006" xmlns:aink="http://schemas.microsoft.com/office/drawing/2016/ink" xmlns:am3d="http://schemas.microsoft.com/office/drawing/2017/model3d" xmlns:o="urn:schemas-microsoft-com:office:office" xmlns:oel="http://schemas.microsoft.com/office/2019/extlst" xmlns:r="http://schemas.openxmlformats.org/officeDocument/2006/relationships" xmlns:m="http://schemas.openxmlformats.org/officeDocument/2006/math" xmlns:v="urn:schemas-microsoft-com:vml" xmlns:wp14="http://schemas.microsoft.com/office/word/2010/wordprocessingDrawing" xmlns:wp="http://schemas.openxmlformats.org/drawingml/2006/wordprocessingDrawing" xmlns:w10="urn:schemas-microsoft-com:office:word" xmlns:w="http://schemas.openxmlformats.org/wordprocessingml/2006/main" xmlns:w14="http://schemas.microsoft.com/office/word/2010/wordml" xmlns:w15="http://schemas.microsoft.com/office/word/2012/wordml" xmlns:w16cei="http://schemas.microsoft.com/office/word/2026/wordml/cei" xmlns:w16cex="http://schemas.microsoft.com/office/word/2018/wordml/cex" xmlns:w16cid="http://schemas.microsoft.com/office/word/2016/wordml/cid" xmlns:w16="http://schemas.microsoft.com/office/word/2018/wordml" xmlns:w16du="http://schemas.microsoft.com/office/word/2023/wordml/word16du" xmlns:w16sdtdh="http://schemas.microsoft.com/office/word/2020/wordml/sdtdatahash" xmlns:w16sdtfl="http://schemas.microsoft.com/office/word/2024/wordml/sdtformatlock" xmlns:w16se="http://schemas.microsoft.com/office/word/2015/wordml/symex" xmlns:wpg="http://schemas.microsoft.com/office/word/2010/wordprocessingGroup" xmlns:wpi="http://schemas.microsoft.com/office/word/2010/wordprocessingInk" xmlns:wne="http://schemas.microsoft.com/office/word/2006/wordml" xmlns:wps="http://schemas.microsoft.com/office/word/2010/wordprocessingShape" mc:Ignorable="w14 w15 w16se w16cid w16 w16cex w16sdtdh w16sdtfl w16du wp14">
   <w:endnote w:type="separator" w:id="-1">
     <w:p>
       <w:pPr>
@@ -707,7 +925,7 @@
 </file>
 
 <file path=word/footer1.xml><?xml version="1.0" encoding="utf-8"?>
-<w:ftr xmlns:wpc="http://schemas.microsoft.com/office/word/2010/wordprocessingCanvas" xmlns:cx="http://schemas.microsoft.com/office/drawing/2014/chartex" xmlns:cx1="http://schemas.microsoft.com/office/drawing/2015/9/8/chartex" xmlns:cx2="http://schemas.microsoft.com/office/drawing/2015/10/21/chartex" xmlns:cx3="http://schemas.microsoft.com/office/drawing/2016/5/9/chartex" xmlns:cx4="http://schemas.microsoft.com/office/drawing/2016/5/10/chartex" xmlns:cx5="http://schemas.microsoft.com/office/drawing/2016/5/11/chartex" xmlns:cx6="http://schemas.microsoft.com/office/drawing/2016/5/12/chartex" xmlns:cx7="http://schemas.microsoft.com/office/drawing/2016/5/13/chartex" xmlns:cx8="http://schemas.microsoft.com/office/drawing/2016/5/14/chartex" xmlns:mc="http://schemas.openxmlformats.org/markup-compatibility/2006" xmlns:aink="http://schemas.microsoft.com/office/drawing/2016/ink" xmlns:am3d="http://schemas.microsoft.com/office/drawing/2017/model3d" xmlns:o="urn:schemas-microsoft-com:office:office" xmlns:oel="http://schemas.microsoft.com/office/2019/extlst" xmlns:r="http://schemas.openxmlformats.org/officeDocument/2006/relationships" xmlns:m="http://schemas.openxmlformats.org/officeDocument/2006/math" xmlns:v="urn:schemas-microsoft-com:vml" xmlns:wp14="http://schemas.microsoft.com/office/word/2010/wordprocessingDrawing" xmlns:wp="http://schemas.openxmlformats.org/drawingml/2006/wordprocessingDrawing" xmlns:w10="urn:schemas-microsoft-com:office:word" xmlns:w="http://schemas.openxmlformats.org/wordprocessingml/2006/main" xmlns:w14="http://schemas.microsoft.com/office/word/2010/wordml" xmlns:w15="http://schemas.microsoft.com/office/word/2012/wordml" xmlns:w16cex="http://schemas.microsoft.com/office/word/2018/wordml/cex" xmlns:w16cid="http://schemas.microsoft.com/office/word/2016/wordml/cid" xmlns:w16="http://schemas.microsoft.com/office/word/2018/wordml" xmlns:w16du="http://schemas.microsoft.com/office/word/2023/wordml/word16du" xmlns:w16sdtdh="http://schemas.microsoft.com/office/word/2020/wordml/sdtdatahash" xmlns:w16sdtfl="http://schemas.microsoft.com/office/word/2024/wordml/sdtformatlock" xmlns:w16se="http://schemas.microsoft.com/office/word/2015/wordml/symex" xmlns:wpg="http://schemas.microsoft.com/office/word/2010/wordprocessingGroup" xmlns:wpi="http://schemas.microsoft.com/office/word/2010/wordprocessingInk" xmlns:wne="http://schemas.microsoft.com/office/word/2006/wordml" xmlns:wps="http://schemas.microsoft.com/office/word/2010/wordprocessingShape" mc:Ignorable="w14 w15 w16se w16cid w16 w16cex w16sdtdh w16sdtfl w16du wp14">
+<w:ftr xmlns:wpc="http://schemas.microsoft.com/office/word/2010/wordprocessingCanvas" xmlns:cx="http://schemas.microsoft.com/office/drawing/2014/chartex" xmlns:cx1="http://schemas.microsoft.com/office/drawing/2015/9/8/chartex" xmlns:cx2="http://schemas.microsoft.com/office/drawing/2015/10/21/chartex" xmlns:cx3="http://schemas.microsoft.com/office/drawing/2016/5/9/chartex" xmlns:cx4="http://schemas.microsoft.com/office/drawing/2016/5/10/chartex" xmlns:cx5="http://schemas.microsoft.com/office/drawing/2016/5/11/chartex" xmlns:cx6="http://schemas.microsoft.com/office/drawing/2016/5/12/chartex" xmlns:cx7="http://schemas.microsoft.com/office/drawing/2016/5/13/chartex" xmlns:cx8="http://schemas.microsoft.com/office/drawing/2016/5/14/chartex" xmlns:mc="http://schemas.openxmlformats.org/markup-compatibility/2006" xmlns:aink="http://schemas.microsoft.com/office/drawing/2016/ink" xmlns:am3d="http://schemas.microsoft.com/office/drawing/2017/model3d" xmlns:o="urn:schemas-microsoft-com:office:office" xmlns:oel="http://schemas.microsoft.com/office/2019/extlst" xmlns:r="http://schemas.openxmlformats.org/officeDocument/2006/relationships" xmlns:m="http://schemas.openxmlformats.org/officeDocument/2006/math" xmlns:v="urn:schemas-microsoft-com:vml" xmlns:wp14="http://schemas.microsoft.com/office/word/2010/wordprocessingDrawing" xmlns:wp="http://schemas.openxmlformats.org/drawingml/2006/wordprocessingDrawing" xmlns:w10="urn:schemas-microsoft-com:office:word" xmlns:w="http://schemas.openxmlformats.org/wordprocessingml/2006/main" xmlns:w14="http://schemas.microsoft.com/office/word/2010/wordml" xmlns:w15="http://schemas.microsoft.com/office/word/2012/wordml" xmlns:w16cei="http://schemas.microsoft.com/office/word/2026/wordml/cei" xmlns:w16cex="http://schemas.microsoft.com/office/word/2018/wordml/cex" xmlns:w16cid="http://schemas.microsoft.com/office/word/2016/wordml/cid" xmlns:w16="http://schemas.microsoft.com/office/word/2018/wordml" xmlns:w16du="http://schemas.microsoft.com/office/word/2023/wordml/word16du" xmlns:w16sdtdh="http://schemas.microsoft.com/office/word/2020/wordml/sdtdatahash" xmlns:w16sdtfl="http://schemas.microsoft.com/office/word/2024/wordml/sdtformatlock" xmlns:w16se="http://schemas.microsoft.com/office/word/2015/wordml/symex" xmlns:wpg="http://schemas.microsoft.com/office/word/2010/wordprocessingGroup" xmlns:wpi="http://schemas.microsoft.com/office/word/2010/wordprocessingInk" xmlns:wne="http://schemas.microsoft.com/office/word/2006/wordml" xmlns:wps="http://schemas.microsoft.com/office/word/2010/wordprocessingShape" mc:Ignorable="w14 w15 w16se w16cid w16 w16cex w16sdtdh w16sdtfl w16du wp14">
   <w:sdt>
     <w:sdtPr>
       <w:id w:val="-1131095802"/>
@@ -727,7 +945,7 @@
         <w:pPr>
           <w:pStyle w:val="Footer"/>
           <w:pBdr>
-            <w:top w:val="single" w:color="D9D9D9" w:themeColor="background1" w:themeShade="D9" w:sz="4" w:space="1"/>
+            <w:top w:val="single" w:sz="4" w:space="1" w:color="D9D9D9" w:themeColor="background1" w:themeShade="D9"/>
           </w:pBdr>
           <w:jc w:val="right"/>
         </w:pPr>
@@ -769,7 +987,7 @@
 </file>
 
 <file path=word/footnotes.xml><?xml version="1.0" encoding="utf-8"?>
-<w:footnotes xmlns:wpc="http://schemas.microsoft.com/office/word/2010/wordprocessingCanvas" xmlns:cx="http://schemas.microsoft.com/office/drawing/2014/chartex" xmlns:cx1="http://schemas.microsoft.com/office/drawing/2015/9/8/chartex" xmlns:cx2="http://schemas.microsoft.com/office/drawing/2015/10/21/chartex" xmlns:cx3="http://schemas.microsoft.com/office/drawing/2016/5/9/chartex" xmlns:cx4="http://schemas.microsoft.com/office/drawing/2016/5/10/chartex" xmlns:cx5="http://schemas.microsoft.com/office/drawing/2016/5/11/chartex" xmlns:cx6="http://schemas.microsoft.com/office/drawing/2016/5/12/chartex" xmlns:cx7="http://schemas.microsoft.com/office/drawing/2016/5/13/chartex" xmlns:cx8="http://schemas.microsoft.com/office/drawing/2016/5/14/chartex" xmlns:mc="http://schemas.openxmlformats.org/markup-compatibility/2006" xmlns:aink="http://schemas.microsoft.com/office/drawing/2016/ink" xmlns:am3d="http://schemas.microsoft.com/office/drawing/2017/model3d" xmlns:o="urn:schemas-microsoft-com:office:office" xmlns:oel="http://schemas.microsoft.com/office/2019/extlst" xmlns:r="http://schemas.openxmlformats.org/officeDocument/2006/relationships" xmlns:m="http://schemas.openxmlformats.org/officeDocument/2006/math" xmlns:v="urn:schemas-microsoft-com:vml" xmlns:wp14="http://schemas.microsoft.com/office/word/2010/wordprocessingDrawing" xmlns:wp="http://schemas.openxmlformats.org/drawingml/2006/wordprocessingDrawing" xmlns:w10="urn:schemas-microsoft-com:office:word" xmlns:w="http://schemas.openxmlformats.org/wordprocessingml/2006/main" xmlns:w14="http://schemas.microsoft.com/office/word/2010/wordml" xmlns:w15="http://schemas.microsoft.com/office/word/2012/wordml" xmlns:w16cex="http://schemas.microsoft.com/office/word/2018/wordml/cex" xmlns:w16cid="http://schemas.microsoft.com/office/word/2016/wordml/cid" xmlns:w16="http://schemas.microsoft.com/office/word/2018/wordml" xmlns:w16du="http://schemas.microsoft.com/office/word/2023/wordml/word16du" xmlns:w16sdtdh="http://schemas.microsoft.com/office/word/2020/wordml/sdtdatahash" xmlns:w16sdtfl="http://schemas.microsoft.com/office/word/2024/wordml/sdtformatlock" xmlns:w16se="http://schemas.microsoft.com/office/word/2015/wordml/symex" xmlns:wpg="http://schemas.microsoft.com/office/word/2010/wordprocessingGroup" xmlns:wpi="http://schemas.microsoft.com/office/word/2010/wordprocessingInk" xmlns:wne="http://schemas.microsoft.com/office/word/2006/wordml" xmlns:wps="http://schemas.microsoft.com/office/word/2010/wordprocessingShape" mc:Ignorable="w14 w15 w16se w16cid w16 w16cex w16sdtdh w16sdtfl w16du wp14">
+<w:footnotes xmlns:wpc="http://schemas.microsoft.com/office/word/2010/wordprocessingCanvas" xmlns:cx="http://schemas.microsoft.com/office/drawing/2014/chartex" xmlns:cx1="http://schemas.microsoft.com/office/drawing/2015/9/8/chartex" xmlns:cx2="http://schemas.microsoft.com/office/drawing/2015/10/21/chartex" xmlns:cx3="http://schemas.microsoft.com/office/drawing/2016/5/9/chartex" xmlns:cx4="http://schemas.microsoft.com/office/drawing/2016/5/10/chartex" xmlns:cx5="http://schemas.microsoft.com/office/drawing/2016/5/11/chartex" xmlns:cx6="http://schemas.microsoft.com/office/drawing/2016/5/12/chartex" xmlns:cx7="http://schemas.microsoft.com/office/drawing/2016/5/13/chartex" xmlns:cx8="http://schemas.microsoft.com/office/drawing/2016/5/14/chartex" xmlns:mc="http://schemas.openxmlformats.org/markup-compatibility/2006" xmlns:aink="http://schemas.microsoft.com/office/drawing/2016/ink" xmlns:am3d="http://schemas.microsoft.com/office/drawing/2017/model3d" xmlns:o="urn:schemas-microsoft-com:office:office" xmlns:oel="http://schemas.microsoft.com/office/2019/extlst" xmlns:r="http://schemas.openxmlformats.org/officeDocument/2006/relationships" xmlns:m="http://schemas.openxmlformats.org/officeDocument/2006/math" xmlns:v="urn:schemas-microsoft-com:vml" xmlns:wp14="http://schemas.microsoft.com/office/word/2010/wordprocessingDrawing" xmlns:wp="http://schemas.openxmlformats.org/drawingml/2006/wordprocessingDrawing" xmlns:w10="urn:schemas-microsoft-com:office:word" xmlns:w="http://schemas.openxmlformats.org/wordprocessingml/2006/main" xmlns:w14="http://schemas.microsoft.com/office/word/2010/wordml" xmlns:w15="http://schemas.microsoft.com/office/word/2012/wordml" xmlns:w16cei="http://schemas.microsoft.com/office/word/2026/wordml/cei" xmlns:w16cex="http://schemas.microsoft.com/office/word/2018/wordml/cex" xmlns:w16cid="http://schemas.microsoft.com/office/word/2016/wordml/cid" xmlns:w16="http://schemas.microsoft.com/office/word/2018/wordml" xmlns:w16du="http://schemas.microsoft.com/office/word/2023/wordml/word16du" xmlns:w16sdtdh="http://schemas.microsoft.com/office/word/2020/wordml/sdtdatahash" xmlns:w16sdtfl="http://schemas.microsoft.com/office/word/2024/wordml/sdtformatlock" xmlns:w16se="http://schemas.microsoft.com/office/word/2015/wordml/symex" xmlns:wpg="http://schemas.microsoft.com/office/word/2010/wordprocessingGroup" xmlns:wpi="http://schemas.microsoft.com/office/word/2010/wordprocessingInk" xmlns:wne="http://schemas.microsoft.com/office/word/2006/wordml" xmlns:wps="http://schemas.microsoft.com/office/word/2010/wordprocessingShape" mc:Ignorable="w14 w15 w16se w16cid w16 w16cex w16sdtdh w16sdtfl w16du wp14">
   <w:footnote w:type="separator" w:id="-1">
     <w:p>
       <w:pPr>
@@ -794,7 +1012,7 @@
 </file>
 
 <file path=word/header1.xml><?xml version="1.0" encoding="utf-8"?>
-<w:hdr xmlns:wpc="http://schemas.microsoft.com/office/word/2010/wordprocessingCanvas" xmlns:cx="http://schemas.microsoft.com/office/drawing/2014/chartex" xmlns:cx1="http://schemas.microsoft.com/office/drawing/2015/9/8/chartex" xmlns:cx2="http://schemas.microsoft.com/office/drawing/2015/10/21/chartex" xmlns:cx3="http://schemas.microsoft.com/office/drawing/2016/5/9/chartex" xmlns:cx4="http://schemas.microsoft.com/office/drawing/2016/5/10/chartex" xmlns:cx5="http://schemas.microsoft.com/office/drawing/2016/5/11/chartex" xmlns:cx6="http://schemas.microsoft.com/office/drawing/2016/5/12/chartex" xmlns:cx7="http://schemas.microsoft.com/office/drawing/2016/5/13/chartex" xmlns:cx8="http://schemas.microsoft.com/office/drawing/2016/5/14/chartex" xmlns:mc="http://schemas.openxmlformats.org/markup-compatibility/2006" xmlns:aink="http://schemas.microsoft.com/office/drawing/2016/ink" xmlns:am3d="http://schemas.microsoft.com/office/drawing/2017/model3d" xmlns:o="urn:schemas-microsoft-com:office:office" xmlns:oel="http://schemas.microsoft.com/office/2019/extlst" xmlns:r="http://schemas.openxmlformats.org/officeDocument/2006/relationships" xmlns:m="http://schemas.openxmlformats.org/officeDocument/2006/math" xmlns:v="urn:schemas-microsoft-com:vml" xmlns:wp14="http://schemas.microsoft.com/office/word/2010/wordprocessingDrawing" xmlns:wp="http://schemas.openxmlformats.org/drawingml/2006/wordprocessingDrawing" xmlns:w10="urn:schemas-microsoft-com:office:word" xmlns:w="http://schemas.openxmlformats.org/wordprocessingml/2006/main" xmlns:w14="http://schemas.microsoft.com/office/word/2010/wordml" xmlns:w15="http://schemas.microsoft.com/office/word/2012/wordml" xmlns:w16cex="http://schemas.microsoft.com/office/word/2018/wordml/cex" xmlns:w16cid="http://schemas.microsoft.com/office/word/2016/wordml/cid" xmlns:w16="http://schemas.microsoft.com/office/word/2018/wordml" xmlns:w16du="http://schemas.microsoft.com/office/word/2023/wordml/word16du" xmlns:w16sdtdh="http://schemas.microsoft.com/office/word/2020/wordml/sdtdatahash" xmlns:w16sdtfl="http://schemas.microsoft.com/office/word/2024/wordml/sdtformatlock" xmlns:w16se="http://schemas.microsoft.com/office/word/2015/wordml/symex" xmlns:wpg="http://schemas.microsoft.com/office/word/2010/wordprocessingGroup" xmlns:wpi="http://schemas.microsoft.com/office/word/2010/wordprocessingInk" xmlns:wne="http://schemas.microsoft.com/office/word/2006/wordml" xmlns:wps="http://schemas.microsoft.com/office/word/2010/wordprocessingShape" xmlns:a="http://schemas.openxmlformats.org/drawingml/2006/main" xmlns:pic="http://schemas.openxmlformats.org/drawingml/2006/picture" xmlns:a14="http://schemas.microsoft.com/office/drawing/2010/main" mc:Ignorable="w14 w15 w16se w16cid w16 w16cex w16sdtdh w16sdtfl w16du wp14">
+<w:hdr xmlns:wpc="http://schemas.microsoft.com/office/word/2010/wordprocessingCanvas" xmlns:cx="http://schemas.microsoft.com/office/drawing/2014/chartex" xmlns:cx1="http://schemas.microsoft.com/office/drawing/2015/9/8/chartex" xmlns:cx2="http://schemas.microsoft.com/office/drawing/2015/10/21/chartex" xmlns:cx3="http://schemas.microsoft.com/office/drawing/2016/5/9/chartex" xmlns:cx4="http://schemas.microsoft.com/office/drawing/2016/5/10/chartex" xmlns:cx5="http://schemas.microsoft.com/office/drawing/2016/5/11/chartex" xmlns:cx6="http://schemas.microsoft.com/office/drawing/2016/5/12/chartex" xmlns:cx7="http://schemas.microsoft.com/office/drawing/2016/5/13/chartex" xmlns:cx8="http://schemas.microsoft.com/office/drawing/2016/5/14/chartex" xmlns:mc="http://schemas.openxmlformats.org/markup-compatibility/2006" xmlns:aink="http://schemas.microsoft.com/office/drawing/2016/ink" xmlns:am3d="http://schemas.microsoft.com/office/drawing/2017/model3d" xmlns:o="urn:schemas-microsoft-com:office:office" xmlns:oel="http://schemas.microsoft.com/office/2019/extlst" xmlns:r="http://schemas.openxmlformats.org/officeDocument/2006/relationships" xmlns:m="http://schemas.openxmlformats.org/officeDocument/2006/math" xmlns:v="urn:schemas-microsoft-com:vml" xmlns:wp14="http://schemas.microsoft.com/office/word/2010/wordprocessingDrawing" xmlns:wp="http://schemas.openxmlformats.org/drawingml/2006/wordprocessingDrawing" xmlns:w10="urn:schemas-microsoft-com:office:word" xmlns:w="http://schemas.openxmlformats.org/wordprocessingml/2006/main" xmlns:w14="http://schemas.microsoft.com/office/word/2010/wordml" xmlns:w15="http://schemas.microsoft.com/office/word/2012/wordml" xmlns:w16cei="http://schemas.microsoft.com/office/word/2026/wordml/cei" xmlns:w16cex="http://schemas.microsoft.com/office/word/2018/wordml/cex" xmlns:w16cid="http://schemas.microsoft.com/office/word/2016/wordml/cid" xmlns:w16="http://schemas.microsoft.com/office/word/2018/wordml" xmlns:w16du="http://schemas.microsoft.com/office/word/2023/wordml/word16du" xmlns:w16sdtdh="http://schemas.microsoft.com/office/word/2020/wordml/sdtdatahash" xmlns:w16sdtfl="http://schemas.microsoft.com/office/word/2024/wordml/sdtformatlock" xmlns:w16se="http://schemas.microsoft.com/office/word/2015/wordml/symex" xmlns:wpg="http://schemas.microsoft.com/office/word/2010/wordprocessingGroup" xmlns:wpi="http://schemas.microsoft.com/office/word/2010/wordprocessingInk" xmlns:wne="http://schemas.microsoft.com/office/word/2006/wordml" xmlns:wps="http://schemas.microsoft.com/office/word/2010/wordprocessingShape" mc:Ignorable="w14 w15 w16se w16cid w16 w16cex w16sdtdh w16sdtfl w16du wp14">
   <w:p>
     <w:pPr>
       <w:pStyle w:val="Header"/>
@@ -871,7 +1089,7 @@
 </file>
 
 <file path=word/numbering.xml><?xml version="1.0" encoding="utf-8"?>
-<w:numbering xmlns:wpc="http://schemas.microsoft.com/office/word/2010/wordprocessingCanvas" xmlns:cx="http://schemas.microsoft.com/office/drawing/2014/chartex" xmlns:cx1="http://schemas.microsoft.com/office/drawing/2015/9/8/chartex" xmlns:cx2="http://schemas.microsoft.com/office/drawing/2015/10/21/chartex" xmlns:cx3="http://schemas.microsoft.com/office/drawing/2016/5/9/chartex" xmlns:cx4="http://schemas.microsoft.com/office/drawing/2016/5/10/chartex" xmlns:cx5="http://schemas.microsoft.com/office/drawing/2016/5/11/chartex" xmlns:cx6="http://schemas.microsoft.com/office/drawing/2016/5/12/chartex" xmlns:cx7="http://schemas.microsoft.com/office/drawing/2016/5/13/chartex" xmlns:cx8="http://schemas.microsoft.com/office/drawing/2016/5/14/chartex" xmlns:mc="http://schemas.openxmlformats.org/markup-compatibility/2006" xmlns:aink="http://schemas.microsoft.com/office/drawing/2016/ink" xmlns:am3d="http://schemas.microsoft.com/office/drawing/2017/model3d" xmlns:o="urn:schemas-microsoft-com:office:office" xmlns:oel="http://schemas.microsoft.com/office/2019/extlst" xmlns:r="http://schemas.openxmlformats.org/officeDocument/2006/relationships" xmlns:m="http://schemas.openxmlformats.org/officeDocument/2006/math" xmlns:v="urn:schemas-microsoft-com:vml" xmlns:wp14="http://schemas.microsoft.com/office/word/2010/wordprocessingDrawing" xmlns:wp="http://schemas.openxmlformats.org/drawingml/2006/wordprocessingDrawing" xmlns:w10="urn:schemas-microsoft-com:office:word" xmlns:w="http://schemas.openxmlformats.org/wordprocessingml/2006/main" xmlns:w14="http://schemas.microsoft.com/office/word/2010/wordml" xmlns:w15="http://schemas.microsoft.com/office/word/2012/wordml" xmlns:w16cex="http://schemas.microsoft.com/office/word/2018/wordml/cex" xmlns:w16cid="http://schemas.microsoft.com/office/word/2016/wordml/cid" xmlns:w16="http://schemas.microsoft.com/office/word/2018/wordml" xmlns:w16du="http://schemas.microsoft.com/office/word/2023/wordml/word16du" xmlns:w16sdtdh="http://schemas.microsoft.com/office/word/2020/wordml/sdtdatahash" xmlns:w16sdtfl="http://schemas.microsoft.com/office/word/2024/wordml/sdtformatlock" xmlns:w16se="http://schemas.microsoft.com/office/word/2015/wordml/symex" xmlns:wpg="http://schemas.microsoft.com/office/word/2010/wordprocessingGroup" xmlns:wpi="http://schemas.microsoft.com/office/word/2010/wordprocessingInk" xmlns:wne="http://schemas.microsoft.com/office/word/2006/wordml" xmlns:wps="http://schemas.microsoft.com/office/word/2010/wordprocessingShape" mc:Ignorable="w14 w15 w16se w16cid w16 w16cex w16sdtdh w16sdtfl w16du wp14">
+<w:numbering xmlns:wpc="http://schemas.microsoft.com/office/word/2010/wordprocessingCanvas" xmlns:cx="http://schemas.microsoft.com/office/drawing/2014/chartex" xmlns:cx1="http://schemas.microsoft.com/office/drawing/2015/9/8/chartex" xmlns:cx2="http://schemas.microsoft.com/office/drawing/2015/10/21/chartex" xmlns:cx3="http://schemas.microsoft.com/office/drawing/2016/5/9/chartex" xmlns:cx4="http://schemas.microsoft.com/office/drawing/2016/5/10/chartex" xmlns:cx5="http://schemas.microsoft.com/office/drawing/2016/5/11/chartex" xmlns:cx6="http://schemas.microsoft.com/office/drawing/2016/5/12/chartex" xmlns:cx7="http://schemas.microsoft.com/office/drawing/2016/5/13/chartex" xmlns:cx8="http://schemas.microsoft.com/office/drawing/2016/5/14/chartex" xmlns:mc="http://schemas.openxmlformats.org/markup-compatibility/2006" xmlns:aink="http://schemas.microsoft.com/office/drawing/2016/ink" xmlns:am3d="http://schemas.microsoft.com/office/drawing/2017/model3d" xmlns:o="urn:schemas-microsoft-com:office:office" xmlns:oel="http://schemas.microsoft.com/office/2019/extlst" xmlns:r="http://schemas.openxmlformats.org/officeDocument/2006/relationships" xmlns:m="http://schemas.openxmlformats.org/officeDocument/2006/math" xmlns:v="urn:schemas-microsoft-com:vml" xmlns:wp14="http://schemas.microsoft.com/office/word/2010/wordprocessingDrawing" xmlns:wp="http://schemas.openxmlformats.org/drawingml/2006/wordprocessingDrawing" xmlns:w10="urn:schemas-microsoft-com:office:word" xmlns:w="http://schemas.openxmlformats.org/wordprocessingml/2006/main" xmlns:w14="http://schemas.microsoft.com/office/word/2010/wordml" xmlns:w15="http://schemas.microsoft.com/office/word/2012/wordml" xmlns:w16cei="http://schemas.microsoft.com/office/word/2026/wordml/cei" xmlns:w16cex="http://schemas.microsoft.com/office/word/2018/wordml/cex" xmlns:w16cid="http://schemas.microsoft.com/office/word/2016/wordml/cid" xmlns:w16="http://schemas.microsoft.com/office/word/2018/wordml" xmlns:w16du="http://schemas.microsoft.com/office/word/2023/wordml/word16du" xmlns:w16sdtdh="http://schemas.microsoft.com/office/word/2020/wordml/sdtdatahash" xmlns:w16sdtfl="http://schemas.microsoft.com/office/word/2024/wordml/sdtformatlock" xmlns:w16se="http://schemas.microsoft.com/office/word/2015/wordml/symex" xmlns:wpg="http://schemas.microsoft.com/office/word/2010/wordprocessingGroup" xmlns:wpi="http://schemas.microsoft.com/office/word/2010/wordprocessingInk" xmlns:wne="http://schemas.microsoft.com/office/word/2006/wordml" xmlns:wps="http://schemas.microsoft.com/office/word/2010/wordprocessingShape" mc:Ignorable="w14 w15 w16se w16cid w16 w16cex w16sdtdh w16sdtfl w16du wp14">
   <w:abstractNum w:abstractNumId="0" w15:restartNumberingAfterBreak="0">
     <w:nsid w:val="011C3937"/>
     <w:multiLevelType w:val="multilevel"/>
@@ -888,7 +1106,7 @@
         <w:ind w:left="720" w:hanging="360"/>
       </w:pPr>
       <w:rPr>
-        <w:rFonts w:hint="default" w:ascii="Symbol" w:hAnsi="Symbol"/>
+        <w:rFonts w:ascii="Symbol" w:hAnsi="Symbol" w:hint="default"/>
         <w:sz w:val="20"/>
       </w:rPr>
     </w:lvl>
@@ -904,7 +1122,7 @@
         <w:ind w:left="1440" w:hanging="360"/>
       </w:pPr>
       <w:rPr>
-        <w:rFonts w:hint="default" w:ascii="Courier New" w:hAnsi="Courier New"/>
+        <w:rFonts w:ascii="Courier New" w:hAnsi="Courier New" w:hint="default"/>
         <w:sz w:val="20"/>
       </w:rPr>
     </w:lvl>
@@ -920,7 +1138,7 @@
         <w:ind w:left="2160" w:hanging="360"/>
       </w:pPr>
       <w:rPr>
-        <w:rFonts w:hint="default" w:ascii="Wingdings" w:hAnsi="Wingdings"/>
+        <w:rFonts w:ascii="Wingdings" w:hAnsi="Wingdings" w:hint="default"/>
         <w:sz w:val="20"/>
       </w:rPr>
     </w:lvl>
@@ -936,7 +1154,7 @@
         <w:ind w:left="2880" w:hanging="360"/>
       </w:pPr>
       <w:rPr>
-        <w:rFonts w:hint="default" w:ascii="Wingdings" w:hAnsi="Wingdings"/>
+        <w:rFonts w:ascii="Wingdings" w:hAnsi="Wingdings" w:hint="default"/>
         <w:sz w:val="20"/>
       </w:rPr>
     </w:lvl>
@@ -952,7 +1170,7 @@
         <w:ind w:left="3600" w:hanging="360"/>
       </w:pPr>
       <w:rPr>
-        <w:rFonts w:hint="default" w:ascii="Wingdings" w:hAnsi="Wingdings"/>
+        <w:rFonts w:ascii="Wingdings" w:hAnsi="Wingdings" w:hint="default"/>
         <w:sz w:val="20"/>
       </w:rPr>
     </w:lvl>
@@ -968,7 +1186,7 @@
         <w:ind w:left="4320" w:hanging="360"/>
       </w:pPr>
       <w:rPr>
-        <w:rFonts w:hint="default" w:ascii="Wingdings" w:hAnsi="Wingdings"/>
+        <w:rFonts w:ascii="Wingdings" w:hAnsi="Wingdings" w:hint="default"/>
         <w:sz w:val="20"/>
       </w:rPr>
     </w:lvl>
@@ -984,7 +1202,7 @@
         <w:ind w:left="5040" w:hanging="360"/>
       </w:pPr>
       <w:rPr>
-        <w:rFonts w:hint="default" w:ascii="Wingdings" w:hAnsi="Wingdings"/>
+        <w:rFonts w:ascii="Wingdings" w:hAnsi="Wingdings" w:hint="default"/>
         <w:sz w:val="20"/>
       </w:rPr>
     </w:lvl>
@@ -1000,7 +1218,7 @@
         <w:ind w:left="5760" w:hanging="360"/>
       </w:pPr>
       <w:rPr>
-        <w:rFonts w:hint="default" w:ascii="Wingdings" w:hAnsi="Wingdings"/>
+        <w:rFonts w:ascii="Wingdings" w:hAnsi="Wingdings" w:hint="default"/>
         <w:sz w:val="20"/>
       </w:rPr>
     </w:lvl>
@@ -1016,7 +1234,7 @@
         <w:ind w:left="6480" w:hanging="360"/>
       </w:pPr>
       <w:rPr>
-        <w:rFonts w:hint="default" w:ascii="Wingdings" w:hAnsi="Wingdings"/>
+        <w:rFonts w:ascii="Wingdings" w:hAnsi="Wingdings" w:hint="default"/>
         <w:sz w:val="20"/>
       </w:rPr>
     </w:lvl>
@@ -1054,7 +1272,7 @@
         <w:ind w:left="1440" w:hanging="360"/>
       </w:pPr>
       <w:rPr>
-        <w:rFonts w:hint="default" w:ascii="Courier New" w:hAnsi="Courier New"/>
+        <w:rFonts w:ascii="Courier New" w:hAnsi="Courier New" w:hint="default"/>
         <w:sz w:val="20"/>
       </w:rPr>
     </w:lvl>
@@ -1070,7 +1288,7 @@
         <w:ind w:left="2160" w:hanging="360"/>
       </w:pPr>
       <w:rPr>
-        <w:rFonts w:hint="default" w:ascii="Wingdings" w:hAnsi="Wingdings"/>
+        <w:rFonts w:ascii="Wingdings" w:hAnsi="Wingdings" w:hint="default"/>
         <w:sz w:val="20"/>
       </w:rPr>
     </w:lvl>
@@ -1086,7 +1304,7 @@
         <w:ind w:left="2880" w:hanging="360"/>
       </w:pPr>
       <w:rPr>
-        <w:rFonts w:hint="default" w:ascii="Wingdings" w:hAnsi="Wingdings"/>
+        <w:rFonts w:ascii="Wingdings" w:hAnsi="Wingdings" w:hint="default"/>
         <w:sz w:val="20"/>
       </w:rPr>
     </w:lvl>
@@ -1102,7 +1320,7 @@
         <w:ind w:left="3600" w:hanging="360"/>
       </w:pPr>
       <w:rPr>
-        <w:rFonts w:hint="default" w:ascii="Wingdings" w:hAnsi="Wingdings"/>
+        <w:rFonts w:ascii="Wingdings" w:hAnsi="Wingdings" w:hint="default"/>
         <w:sz w:val="20"/>
       </w:rPr>
     </w:lvl>
@@ -1118,7 +1336,7 @@
         <w:ind w:left="4320" w:hanging="360"/>
       </w:pPr>
       <w:rPr>
-        <w:rFonts w:hint="default" w:ascii="Wingdings" w:hAnsi="Wingdings"/>
+        <w:rFonts w:ascii="Wingdings" w:hAnsi="Wingdings" w:hint="default"/>
         <w:sz w:val="20"/>
       </w:rPr>
     </w:lvl>
@@ -1134,7 +1352,7 @@
         <w:ind w:left="5040" w:hanging="360"/>
       </w:pPr>
       <w:rPr>
-        <w:rFonts w:hint="default" w:ascii="Wingdings" w:hAnsi="Wingdings"/>
+        <w:rFonts w:ascii="Wingdings" w:hAnsi="Wingdings" w:hint="default"/>
         <w:sz w:val="20"/>
       </w:rPr>
     </w:lvl>
@@ -1150,7 +1368,7 @@
         <w:ind w:left="5760" w:hanging="360"/>
       </w:pPr>
       <w:rPr>
-        <w:rFonts w:hint="default" w:ascii="Wingdings" w:hAnsi="Wingdings"/>
+        <w:rFonts w:ascii="Wingdings" w:hAnsi="Wingdings" w:hint="default"/>
         <w:sz w:val="20"/>
       </w:rPr>
     </w:lvl>
@@ -1166,7 +1384,7 @@
         <w:ind w:left="6480" w:hanging="360"/>
       </w:pPr>
       <w:rPr>
-        <w:rFonts w:hint="default" w:ascii="Wingdings" w:hAnsi="Wingdings"/>
+        <w:rFonts w:ascii="Wingdings" w:hAnsi="Wingdings" w:hint="default"/>
         <w:sz w:val="20"/>
       </w:rPr>
     </w:lvl>
@@ -1184,7 +1402,7 @@
         <w:ind w:left="720" w:hanging="360"/>
       </w:pPr>
       <w:rPr>
-        <w:rFonts w:hint="default" w:ascii="Symbol" w:hAnsi="Symbol"/>
+        <w:rFonts w:ascii="Symbol" w:hAnsi="Symbol" w:hint="default"/>
       </w:rPr>
     </w:lvl>
     <w:lvl w:ilvl="1" w:tplc="04090003">
@@ -1196,7 +1414,7 @@
         <w:ind w:left="1440" w:hanging="360"/>
       </w:pPr>
       <w:rPr>
-        <w:rFonts w:hint="default" w:ascii="Courier New" w:hAnsi="Courier New" w:cs="Courier New"/>
+        <w:rFonts w:ascii="Courier New" w:hAnsi="Courier New" w:cs="Courier New" w:hint="default"/>
       </w:rPr>
     </w:lvl>
     <w:lvl w:ilvl="2" w:tplc="04090005">
@@ -1208,7 +1426,7 @@
         <w:ind w:left="2160" w:hanging="360"/>
       </w:pPr>
       <w:rPr>
-        <w:rFonts w:hint="default" w:ascii="Wingdings" w:hAnsi="Wingdings"/>
+        <w:rFonts w:ascii="Wingdings" w:hAnsi="Wingdings" w:hint="default"/>
       </w:rPr>
     </w:lvl>
     <w:lvl w:ilvl="3" w:tplc="04090001">
@@ -1220,7 +1438,7 @@
         <w:ind w:left="2880" w:hanging="360"/>
       </w:pPr>
       <w:rPr>
-        <w:rFonts w:hint="default" w:ascii="Symbol" w:hAnsi="Symbol"/>
+        <w:rFonts w:ascii="Symbol" w:hAnsi="Symbol" w:hint="default"/>
       </w:rPr>
     </w:lvl>
     <w:lvl w:ilvl="4" w:tplc="04090003">
@@ -1232,7 +1450,7 @@
         <w:ind w:left="3600" w:hanging="360"/>
       </w:pPr>
       <w:rPr>
-        <w:rFonts w:hint="default" w:ascii="Courier New" w:hAnsi="Courier New" w:cs="Courier New"/>
+        <w:rFonts w:ascii="Courier New" w:hAnsi="Courier New" w:cs="Courier New" w:hint="default"/>
       </w:rPr>
     </w:lvl>
     <w:lvl w:ilvl="5" w:tplc="04090005">
@@ -1244,7 +1462,7 @@
         <w:ind w:left="4320" w:hanging="360"/>
       </w:pPr>
       <w:rPr>
-        <w:rFonts w:hint="default" w:ascii="Wingdings" w:hAnsi="Wingdings"/>
+        <w:rFonts w:ascii="Wingdings" w:hAnsi="Wingdings" w:hint="default"/>
       </w:rPr>
     </w:lvl>
     <w:lvl w:ilvl="6" w:tplc="04090001">
@@ -1256,7 +1474,7 @@
         <w:ind w:left="5040" w:hanging="360"/>
       </w:pPr>
       <w:rPr>
-        <w:rFonts w:hint="default" w:ascii="Symbol" w:hAnsi="Symbol"/>
+        <w:rFonts w:ascii="Symbol" w:hAnsi="Symbol" w:hint="default"/>
       </w:rPr>
     </w:lvl>
     <w:lvl w:ilvl="7" w:tplc="04090003">
@@ -1268,7 +1486,7 @@
         <w:ind w:left="5760" w:hanging="360"/>
       </w:pPr>
       <w:rPr>
-        <w:rFonts w:hint="default" w:ascii="Courier New" w:hAnsi="Courier New" w:cs="Courier New"/>
+        <w:rFonts w:ascii="Courier New" w:hAnsi="Courier New" w:cs="Courier New" w:hint="default"/>
       </w:rPr>
     </w:lvl>
     <w:lvl w:ilvl="8" w:tplc="04090005">
@@ -1280,7 +1498,7 @@
         <w:ind w:left="6480" w:hanging="360"/>
       </w:pPr>
       <w:rPr>
-        <w:rFonts w:hint="default" w:ascii="Wingdings" w:hAnsi="Wingdings"/>
+        <w:rFonts w:ascii="Wingdings" w:hAnsi="Wingdings" w:hint="default"/>
       </w:rPr>
     </w:lvl>
   </w:abstractNum>
@@ -1608,7 +1826,7 @@
         <w:ind w:left="1440" w:hanging="360"/>
       </w:pPr>
       <w:rPr>
-        <w:rFonts w:hint="default" w:ascii="Courier New" w:hAnsi="Courier New"/>
+        <w:rFonts w:ascii="Courier New" w:hAnsi="Courier New" w:hint="default"/>
         <w:sz w:val="20"/>
       </w:rPr>
     </w:lvl>
@@ -1624,7 +1842,7 @@
         <w:ind w:left="2160" w:hanging="360"/>
       </w:pPr>
       <w:rPr>
-        <w:rFonts w:hint="default" w:ascii="Wingdings" w:hAnsi="Wingdings"/>
+        <w:rFonts w:ascii="Wingdings" w:hAnsi="Wingdings" w:hint="default"/>
         <w:sz w:val="20"/>
       </w:rPr>
     </w:lvl>
@@ -1640,7 +1858,7 @@
         <w:ind w:left="2880" w:hanging="360"/>
       </w:pPr>
       <w:rPr>
-        <w:rFonts w:hint="default" w:ascii="Wingdings" w:hAnsi="Wingdings"/>
+        <w:rFonts w:ascii="Wingdings" w:hAnsi="Wingdings" w:hint="default"/>
         <w:sz w:val="20"/>
       </w:rPr>
     </w:lvl>
@@ -1656,7 +1874,7 @@
         <w:ind w:left="3600" w:hanging="360"/>
       </w:pPr>
       <w:rPr>
-        <w:rFonts w:hint="default" w:ascii="Wingdings" w:hAnsi="Wingdings"/>
+        <w:rFonts w:ascii="Wingdings" w:hAnsi="Wingdings" w:hint="default"/>
         <w:sz w:val="20"/>
       </w:rPr>
     </w:lvl>
@@ -1672,7 +1890,7 @@
         <w:ind w:left="4320" w:hanging="360"/>
       </w:pPr>
       <w:rPr>
-        <w:rFonts w:hint="default" w:ascii="Wingdings" w:hAnsi="Wingdings"/>
+        <w:rFonts w:ascii="Wingdings" w:hAnsi="Wingdings" w:hint="default"/>
         <w:sz w:val="20"/>
       </w:rPr>
     </w:lvl>
@@ -1688,7 +1906,7 @@
         <w:ind w:left="5040" w:hanging="360"/>
       </w:pPr>
       <w:rPr>
-        <w:rFonts w:hint="default" w:ascii="Wingdings" w:hAnsi="Wingdings"/>
+        <w:rFonts w:ascii="Wingdings" w:hAnsi="Wingdings" w:hint="default"/>
         <w:sz w:val="20"/>
       </w:rPr>
     </w:lvl>
@@ -1704,7 +1922,7 @@
         <w:ind w:left="5760" w:hanging="360"/>
       </w:pPr>
       <w:rPr>
-        <w:rFonts w:hint="default" w:ascii="Wingdings" w:hAnsi="Wingdings"/>
+        <w:rFonts w:ascii="Wingdings" w:hAnsi="Wingdings" w:hint="default"/>
         <w:sz w:val="20"/>
       </w:rPr>
     </w:lvl>
@@ -1720,7 +1938,7 @@
         <w:ind w:left="6480" w:hanging="360"/>
       </w:pPr>
       <w:rPr>
-        <w:rFonts w:hint="default" w:ascii="Wingdings" w:hAnsi="Wingdings"/>
+        <w:rFonts w:ascii="Wingdings" w:hAnsi="Wingdings" w:hint="default"/>
         <w:sz w:val="20"/>
       </w:rPr>
     </w:lvl>
@@ -2058,7 +2276,7 @@
         <w:ind w:left="720" w:hanging="360"/>
       </w:pPr>
       <w:rPr>
-        <w:rFonts w:hint="default" w:ascii="Symbol" w:hAnsi="Symbol"/>
+        <w:rFonts w:ascii="Symbol" w:hAnsi="Symbol" w:hint="default"/>
       </w:rPr>
     </w:lvl>
     <w:lvl w:ilvl="1" w:tplc="04090003" w:tentative="1">
@@ -2070,7 +2288,7 @@
         <w:ind w:left="1440" w:hanging="360"/>
       </w:pPr>
       <w:rPr>
-        <w:rFonts w:hint="default" w:ascii="Courier New" w:hAnsi="Courier New" w:cs="Courier New"/>
+        <w:rFonts w:ascii="Courier New" w:hAnsi="Courier New" w:cs="Courier New" w:hint="default"/>
       </w:rPr>
     </w:lvl>
     <w:lvl w:ilvl="2" w:tplc="04090005" w:tentative="1">
@@ -2082,7 +2300,7 @@
         <w:ind w:left="2160" w:hanging="360"/>
       </w:pPr>
       <w:rPr>
-        <w:rFonts w:hint="default" w:ascii="Wingdings" w:hAnsi="Wingdings"/>
+        <w:rFonts w:ascii="Wingdings" w:hAnsi="Wingdings" w:hint="default"/>
       </w:rPr>
     </w:lvl>
     <w:lvl w:ilvl="3" w:tplc="04090001" w:tentative="1">
@@ -2094,7 +2312,7 @@
         <w:ind w:left="2880" w:hanging="360"/>
       </w:pPr>
       <w:rPr>
-        <w:rFonts w:hint="default" w:ascii="Symbol" w:hAnsi="Symbol"/>
+        <w:rFonts w:ascii="Symbol" w:hAnsi="Symbol" w:hint="default"/>
       </w:rPr>
     </w:lvl>
     <w:lvl w:ilvl="4" w:tplc="04090003" w:tentative="1">
@@ -2106,7 +2324,7 @@
         <w:ind w:left="3600" w:hanging="360"/>
       </w:pPr>
       <w:rPr>
-        <w:rFonts w:hint="default" w:ascii="Courier New" w:hAnsi="Courier New" w:cs="Courier New"/>
+        <w:rFonts w:ascii="Courier New" w:hAnsi="Courier New" w:cs="Courier New" w:hint="default"/>
       </w:rPr>
     </w:lvl>
     <w:lvl w:ilvl="5" w:tplc="04090005" w:tentative="1">
@@ -2118,7 +2336,7 @@
         <w:ind w:left="4320" w:hanging="360"/>
       </w:pPr>
       <w:rPr>
-        <w:rFonts w:hint="default" w:ascii="Wingdings" w:hAnsi="Wingdings"/>
+        <w:rFonts w:ascii="Wingdings" w:hAnsi="Wingdings" w:hint="default"/>
       </w:rPr>
     </w:lvl>
     <w:lvl w:ilvl="6" w:tplc="04090001" w:tentative="1">
@@ -2130,7 +2348,7 @@
         <w:ind w:left="5040" w:hanging="360"/>
       </w:pPr>
       <w:rPr>
-        <w:rFonts w:hint="default" w:ascii="Symbol" w:hAnsi="Symbol"/>
+        <w:rFonts w:ascii="Symbol" w:hAnsi="Symbol" w:hint="default"/>
       </w:rPr>
     </w:lvl>
     <w:lvl w:ilvl="7" w:tplc="04090003" w:tentative="1">
@@ -2142,7 +2360,7 @@
         <w:ind w:left="5760" w:hanging="360"/>
       </w:pPr>
       <w:rPr>
-        <w:rFonts w:hint="default" w:ascii="Courier New" w:hAnsi="Courier New" w:cs="Courier New"/>
+        <w:rFonts w:ascii="Courier New" w:hAnsi="Courier New" w:cs="Courier New" w:hint="default"/>
       </w:rPr>
     </w:lvl>
     <w:lvl w:ilvl="8" w:tplc="04090005" w:tentative="1">
@@ -2154,7 +2372,7 @@
         <w:ind w:left="6480" w:hanging="360"/>
       </w:pPr>
       <w:rPr>
-        <w:rFonts w:hint="default" w:ascii="Wingdings" w:hAnsi="Wingdings"/>
+        <w:rFonts w:ascii="Wingdings" w:hAnsi="Wingdings" w:hint="default"/>
       </w:rPr>
     </w:lvl>
   </w:abstractNum>
@@ -2174,7 +2392,7 @@
         <w:ind w:left="720" w:hanging="360"/>
       </w:pPr>
       <w:rPr>
-        <w:rFonts w:hint="default" w:ascii="Symbol" w:hAnsi="Symbol"/>
+        <w:rFonts w:ascii="Symbol" w:hAnsi="Symbol" w:hint="default"/>
         <w:sz w:val="20"/>
       </w:rPr>
     </w:lvl>
@@ -2190,7 +2408,7 @@
         <w:ind w:left="1440" w:hanging="360"/>
       </w:pPr>
       <w:rPr>
-        <w:rFonts w:hint="default" w:ascii="Symbol" w:hAnsi="Symbol"/>
+        <w:rFonts w:ascii="Symbol" w:hAnsi="Symbol" w:hint="default"/>
         <w:sz w:val="20"/>
       </w:rPr>
     </w:lvl>
@@ -2206,7 +2424,7 @@
         <w:ind w:left="2160" w:hanging="360"/>
       </w:pPr>
       <w:rPr>
-        <w:rFonts w:hint="default" w:ascii="Symbol" w:hAnsi="Symbol"/>
+        <w:rFonts w:ascii="Symbol" w:hAnsi="Symbol" w:hint="default"/>
         <w:sz w:val="20"/>
       </w:rPr>
     </w:lvl>
@@ -2222,7 +2440,7 @@
         <w:ind w:left="2880" w:hanging="360"/>
       </w:pPr>
       <w:rPr>
-        <w:rFonts w:hint="default" w:ascii="Symbol" w:hAnsi="Symbol"/>
+        <w:rFonts w:ascii="Symbol" w:hAnsi="Symbol" w:hint="default"/>
         <w:sz w:val="20"/>
       </w:rPr>
     </w:lvl>
@@ -2238,7 +2456,7 @@
         <w:ind w:left="3600" w:hanging="360"/>
       </w:pPr>
       <w:rPr>
-        <w:rFonts w:hint="default" w:ascii="Symbol" w:hAnsi="Symbol"/>
+        <w:rFonts w:ascii="Symbol" w:hAnsi="Symbol" w:hint="default"/>
         <w:sz w:val="20"/>
       </w:rPr>
     </w:lvl>
@@ -2254,7 +2472,7 @@
         <w:ind w:left="4320" w:hanging="360"/>
       </w:pPr>
       <w:rPr>
-        <w:rFonts w:hint="default" w:ascii="Symbol" w:hAnsi="Symbol"/>
+        <w:rFonts w:ascii="Symbol" w:hAnsi="Symbol" w:hint="default"/>
         <w:sz w:val="20"/>
       </w:rPr>
     </w:lvl>
@@ -2270,7 +2488,7 @@
         <w:ind w:left="5040" w:hanging="360"/>
       </w:pPr>
       <w:rPr>
-        <w:rFonts w:hint="default" w:ascii="Symbol" w:hAnsi="Symbol"/>
+        <w:rFonts w:ascii="Symbol" w:hAnsi="Symbol" w:hint="default"/>
         <w:sz w:val="20"/>
       </w:rPr>
     </w:lvl>
@@ -2286,7 +2504,7 @@
         <w:ind w:left="5760" w:hanging="360"/>
       </w:pPr>
       <w:rPr>
-        <w:rFonts w:hint="default" w:ascii="Symbol" w:hAnsi="Symbol"/>
+        <w:rFonts w:ascii="Symbol" w:hAnsi="Symbol" w:hint="default"/>
         <w:sz w:val="20"/>
       </w:rPr>
     </w:lvl>
@@ -2302,7 +2520,7 @@
         <w:ind w:left="6480" w:hanging="360"/>
       </w:pPr>
       <w:rPr>
-        <w:rFonts w:hint="default" w:ascii="Symbol" w:hAnsi="Symbol"/>
+        <w:rFonts w:ascii="Symbol" w:hAnsi="Symbol" w:hint="default"/>
         <w:sz w:val="20"/>
       </w:rPr>
     </w:lvl>
@@ -2320,7 +2538,7 @@
         <w:ind w:left="720" w:hanging="360"/>
       </w:pPr>
       <w:rPr>
-        <w:rFonts w:hint="default" w:ascii="Symbol" w:hAnsi="Symbol"/>
+        <w:rFonts w:ascii="Symbol" w:hAnsi="Symbol" w:hint="default"/>
       </w:rPr>
     </w:lvl>
     <w:lvl w:ilvl="1" w:tplc="04090003" w:tentative="1">
@@ -2332,7 +2550,7 @@
         <w:ind w:left="1440" w:hanging="360"/>
       </w:pPr>
       <w:rPr>
-        <w:rFonts w:hint="default" w:ascii="Courier New" w:hAnsi="Courier New" w:cs="Courier New"/>
+        <w:rFonts w:ascii="Courier New" w:hAnsi="Courier New" w:cs="Courier New" w:hint="default"/>
       </w:rPr>
     </w:lvl>
     <w:lvl w:ilvl="2" w:tplc="04090005" w:tentative="1">
@@ -2344,7 +2562,7 @@
         <w:ind w:left="2160" w:hanging="360"/>
       </w:pPr>
       <w:rPr>
-        <w:rFonts w:hint="default" w:ascii="Wingdings" w:hAnsi="Wingdings"/>
+        <w:rFonts w:ascii="Wingdings" w:hAnsi="Wingdings" w:hint="default"/>
       </w:rPr>
     </w:lvl>
     <w:lvl w:ilvl="3" w:tplc="04090001" w:tentative="1">
@@ -2356,7 +2574,7 @@
         <w:ind w:left="2880" w:hanging="360"/>
       </w:pPr>
       <w:rPr>
-        <w:rFonts w:hint="default" w:ascii="Symbol" w:hAnsi="Symbol"/>
+        <w:rFonts w:ascii="Symbol" w:hAnsi="Symbol" w:hint="default"/>
       </w:rPr>
     </w:lvl>
     <w:lvl w:ilvl="4" w:tplc="04090003" w:tentative="1">
@@ -2368,7 +2586,7 @@
         <w:ind w:left="3600" w:hanging="360"/>
       </w:pPr>
       <w:rPr>
-        <w:rFonts w:hint="default" w:ascii="Courier New" w:hAnsi="Courier New" w:cs="Courier New"/>
+        <w:rFonts w:ascii="Courier New" w:hAnsi="Courier New" w:cs="Courier New" w:hint="default"/>
       </w:rPr>
     </w:lvl>
     <w:lvl w:ilvl="5" w:tplc="04090005" w:tentative="1">
@@ -2380,7 +2598,7 @@
         <w:ind w:left="4320" w:hanging="360"/>
       </w:pPr>
       <w:rPr>
-        <w:rFonts w:hint="default" w:ascii="Wingdings" w:hAnsi="Wingdings"/>
+        <w:rFonts w:ascii="Wingdings" w:hAnsi="Wingdings" w:hint="default"/>
       </w:rPr>
     </w:lvl>
     <w:lvl w:ilvl="6" w:tplc="04090001" w:tentative="1">
@@ -2392,7 +2610,7 @@
         <w:ind w:left="5040" w:hanging="360"/>
       </w:pPr>
       <w:rPr>
-        <w:rFonts w:hint="default" w:ascii="Symbol" w:hAnsi="Symbol"/>
+        <w:rFonts w:ascii="Symbol" w:hAnsi="Symbol" w:hint="default"/>
       </w:rPr>
     </w:lvl>
     <w:lvl w:ilvl="7" w:tplc="04090003" w:tentative="1">
@@ -2404,7 +2622,7 @@
         <w:ind w:left="5760" w:hanging="360"/>
       </w:pPr>
       <w:rPr>
-        <w:rFonts w:hint="default" w:ascii="Courier New" w:hAnsi="Courier New" w:cs="Courier New"/>
+        <w:rFonts w:ascii="Courier New" w:hAnsi="Courier New" w:cs="Courier New" w:hint="default"/>
       </w:rPr>
     </w:lvl>
     <w:lvl w:ilvl="8" w:tplc="04090005" w:tentative="1">
@@ -2416,7 +2634,7 @@
         <w:ind w:left="6480" w:hanging="360"/>
       </w:pPr>
       <w:rPr>
-        <w:rFonts w:hint="default" w:ascii="Wingdings" w:hAnsi="Wingdings"/>
+        <w:rFonts w:ascii="Wingdings" w:hAnsi="Wingdings" w:hint="default"/>
       </w:rPr>
     </w:lvl>
   </w:abstractNum>
@@ -2433,7 +2651,7 @@
         <w:ind w:left="720" w:hanging="360"/>
       </w:pPr>
       <w:rPr>
-        <w:rFonts w:hint="default" w:ascii="Helvetica Neue" w:hAnsi="Helvetica Neue"/>
+        <w:rFonts w:ascii="Helvetica Neue" w:hAnsi="Helvetica Neue" w:hint="default"/>
         <w:color w:val="2D3748"/>
         <w:sz w:val="27"/>
       </w:rPr>
@@ -2702,7 +2920,7 @@
         <w:ind w:left="1440" w:hanging="360"/>
       </w:pPr>
       <w:rPr>
-        <w:rFonts w:hint="default" w:ascii="Symbol" w:hAnsi="Symbol"/>
+        <w:rFonts w:ascii="Symbol" w:hAnsi="Symbol" w:hint="default"/>
       </w:rPr>
     </w:lvl>
     <w:lvl w:ilvl="1" w:tplc="04090003" w:tentative="1">
@@ -2714,7 +2932,7 @@
         <w:ind w:left="2160" w:hanging="360"/>
       </w:pPr>
       <w:rPr>
-        <w:rFonts w:hint="default" w:ascii="Courier New" w:hAnsi="Courier New" w:cs="Courier New"/>
+        <w:rFonts w:ascii="Courier New" w:hAnsi="Courier New" w:cs="Courier New" w:hint="default"/>
       </w:rPr>
     </w:lvl>
     <w:lvl w:ilvl="2" w:tplc="04090005" w:tentative="1">
@@ -2726,7 +2944,7 @@
         <w:ind w:left="2880" w:hanging="360"/>
       </w:pPr>
       <w:rPr>
-        <w:rFonts w:hint="default" w:ascii="Wingdings" w:hAnsi="Wingdings"/>
+        <w:rFonts w:ascii="Wingdings" w:hAnsi="Wingdings" w:hint="default"/>
       </w:rPr>
     </w:lvl>
     <w:lvl w:ilvl="3" w:tplc="04090001" w:tentative="1">
@@ -2738,7 +2956,7 @@
         <w:ind w:left="3600" w:hanging="360"/>
       </w:pPr>
       <w:rPr>
-        <w:rFonts w:hint="default" w:ascii="Symbol" w:hAnsi="Symbol"/>
+        <w:rFonts w:ascii="Symbol" w:hAnsi="Symbol" w:hint="default"/>
       </w:rPr>
     </w:lvl>
     <w:lvl w:ilvl="4" w:tplc="04090003" w:tentative="1">
@@ -2750,7 +2968,7 @@
         <w:ind w:left="4320" w:hanging="360"/>
       </w:pPr>
       <w:rPr>
-        <w:rFonts w:hint="default" w:ascii="Courier New" w:hAnsi="Courier New" w:cs="Courier New"/>
+        <w:rFonts w:ascii="Courier New" w:hAnsi="Courier New" w:cs="Courier New" w:hint="default"/>
       </w:rPr>
     </w:lvl>
     <w:lvl w:ilvl="5" w:tplc="04090005" w:tentative="1">
@@ -2762,7 +2980,7 @@
         <w:ind w:left="5040" w:hanging="360"/>
       </w:pPr>
       <w:rPr>
-        <w:rFonts w:hint="default" w:ascii="Wingdings" w:hAnsi="Wingdings"/>
+        <w:rFonts w:ascii="Wingdings" w:hAnsi="Wingdings" w:hint="default"/>
       </w:rPr>
     </w:lvl>
     <w:lvl w:ilvl="6" w:tplc="04090001" w:tentative="1">
@@ -2774,7 +2992,7 @@
         <w:ind w:left="5760" w:hanging="360"/>
       </w:pPr>
       <w:rPr>
-        <w:rFonts w:hint="default" w:ascii="Symbol" w:hAnsi="Symbol"/>
+        <w:rFonts w:ascii="Symbol" w:hAnsi="Symbol" w:hint="default"/>
       </w:rPr>
     </w:lvl>
     <w:lvl w:ilvl="7" w:tplc="04090003" w:tentative="1">
@@ -2786,7 +3004,7 @@
         <w:ind w:left="6480" w:hanging="360"/>
       </w:pPr>
       <w:rPr>
-        <w:rFonts w:hint="default" w:ascii="Courier New" w:hAnsi="Courier New" w:cs="Courier New"/>
+        <w:rFonts w:ascii="Courier New" w:hAnsi="Courier New" w:cs="Courier New" w:hint="default"/>
       </w:rPr>
     </w:lvl>
     <w:lvl w:ilvl="8" w:tplc="04090005" w:tentative="1">
@@ -2798,7 +3016,7 @@
         <w:ind w:left="7200" w:hanging="360"/>
       </w:pPr>
       <w:rPr>
-        <w:rFonts w:hint="default" w:ascii="Wingdings" w:hAnsi="Wingdings"/>
+        <w:rFonts w:ascii="Wingdings" w:hAnsi="Wingdings" w:hint="default"/>
       </w:rPr>
     </w:lvl>
   </w:abstractNum>
@@ -2901,7 +3119,7 @@
         <w:ind w:left="720" w:hanging="360"/>
       </w:pPr>
       <w:rPr>
-        <w:rFonts w:hint="default" w:ascii="Symbol" w:hAnsi="Symbol"/>
+        <w:rFonts w:ascii="Symbol" w:hAnsi="Symbol" w:hint="default"/>
       </w:rPr>
     </w:lvl>
     <w:lvl w:ilvl="1" w:tplc="04090003" w:tentative="1">
@@ -2913,7 +3131,7 @@
         <w:ind w:left="1440" w:hanging="360"/>
       </w:pPr>
       <w:rPr>
-        <w:rFonts w:hint="default" w:ascii="Courier New" w:hAnsi="Courier New" w:cs="Courier New"/>
+        <w:rFonts w:ascii="Courier New" w:hAnsi="Courier New" w:cs="Courier New" w:hint="default"/>
       </w:rPr>
     </w:lvl>
     <w:lvl w:ilvl="2" w:tplc="04090005" w:tentative="1">
@@ -2925,7 +3143,7 @@
         <w:ind w:left="2160" w:hanging="360"/>
       </w:pPr>
       <w:rPr>
-        <w:rFonts w:hint="default" w:ascii="Wingdings" w:hAnsi="Wingdings"/>
+        <w:rFonts w:ascii="Wingdings" w:hAnsi="Wingdings" w:hint="default"/>
       </w:rPr>
     </w:lvl>
     <w:lvl w:ilvl="3" w:tplc="04090001" w:tentative="1">
@@ -2937,7 +3155,7 @@
         <w:ind w:left="2880" w:hanging="360"/>
       </w:pPr>
       <w:rPr>
-        <w:rFonts w:hint="default" w:ascii="Symbol" w:hAnsi="Symbol"/>
+        <w:rFonts w:ascii="Symbol" w:hAnsi="Symbol" w:hint="default"/>
       </w:rPr>
     </w:lvl>
     <w:lvl w:ilvl="4" w:tplc="04090003" w:tentative="1">
@@ -2949,7 +3167,7 @@
         <w:ind w:left="3600" w:hanging="360"/>
       </w:pPr>
       <w:rPr>
-        <w:rFonts w:hint="default" w:ascii="Courier New" w:hAnsi="Courier New" w:cs="Courier New"/>
+        <w:rFonts w:ascii="Courier New" w:hAnsi="Courier New" w:cs="Courier New" w:hint="default"/>
       </w:rPr>
     </w:lvl>
     <w:lvl w:ilvl="5" w:tplc="04090005" w:tentative="1">
@@ -2961,7 +3179,7 @@
         <w:ind w:left="4320" w:hanging="360"/>
       </w:pPr>
       <w:rPr>
-        <w:rFonts w:hint="default" w:ascii="Wingdings" w:hAnsi="Wingdings"/>
+        <w:rFonts w:ascii="Wingdings" w:hAnsi="Wingdings" w:hint="default"/>
       </w:rPr>
     </w:lvl>
     <w:lvl w:ilvl="6" w:tplc="04090001" w:tentative="1">
@@ -2973,7 +3191,7 @@
         <w:ind w:left="5040" w:hanging="360"/>
       </w:pPr>
       <w:rPr>
-        <w:rFonts w:hint="default" w:ascii="Symbol" w:hAnsi="Symbol"/>
+        <w:rFonts w:ascii="Symbol" w:hAnsi="Symbol" w:hint="default"/>
       </w:rPr>
     </w:lvl>
     <w:lvl w:ilvl="7" w:tplc="04090003" w:tentative="1">
@@ -2985,7 +3203,7 @@
         <w:ind w:left="5760" w:hanging="360"/>
       </w:pPr>
       <w:rPr>
-        <w:rFonts w:hint="default" w:ascii="Courier New" w:hAnsi="Courier New" w:cs="Courier New"/>
+        <w:rFonts w:ascii="Courier New" w:hAnsi="Courier New" w:cs="Courier New" w:hint="default"/>
       </w:rPr>
     </w:lvl>
     <w:lvl w:ilvl="8" w:tplc="04090005" w:tentative="1">
@@ -2997,7 +3215,7 @@
         <w:ind w:left="6480" w:hanging="360"/>
       </w:pPr>
       <w:rPr>
-        <w:rFonts w:hint="default" w:ascii="Wingdings" w:hAnsi="Wingdings"/>
+        <w:rFonts w:ascii="Wingdings" w:hAnsi="Wingdings" w:hint="default"/>
       </w:rPr>
     </w:lvl>
   </w:abstractNum>
@@ -3034,7 +3252,7 @@
         <w:ind w:left="1440" w:hanging="360"/>
       </w:pPr>
       <w:rPr>
-        <w:rFonts w:hint="default" w:ascii="Courier New" w:hAnsi="Courier New"/>
+        <w:rFonts w:ascii="Courier New" w:hAnsi="Courier New" w:hint="default"/>
         <w:sz w:val="20"/>
       </w:rPr>
     </w:lvl>
@@ -3050,7 +3268,7 @@
         <w:ind w:left="2160" w:hanging="360"/>
       </w:pPr>
       <w:rPr>
-        <w:rFonts w:hint="default" w:ascii="Wingdings" w:hAnsi="Wingdings"/>
+        <w:rFonts w:ascii="Wingdings" w:hAnsi="Wingdings" w:hint="default"/>
         <w:sz w:val="20"/>
       </w:rPr>
     </w:lvl>
@@ -3066,7 +3284,7 @@
         <w:ind w:left="2880" w:hanging="360"/>
       </w:pPr>
       <w:rPr>
-        <w:rFonts w:hint="default" w:ascii="Wingdings" w:hAnsi="Wingdings"/>
+        <w:rFonts w:ascii="Wingdings" w:hAnsi="Wingdings" w:hint="default"/>
         <w:sz w:val="20"/>
       </w:rPr>
     </w:lvl>
@@ -3082,7 +3300,7 @@
         <w:ind w:left="3600" w:hanging="360"/>
       </w:pPr>
       <w:rPr>
-        <w:rFonts w:hint="default" w:ascii="Wingdings" w:hAnsi="Wingdings"/>
+        <w:rFonts w:ascii="Wingdings" w:hAnsi="Wingdings" w:hint="default"/>
         <w:sz w:val="20"/>
       </w:rPr>
     </w:lvl>
@@ -3098,7 +3316,7 @@
         <w:ind w:left="4320" w:hanging="360"/>
       </w:pPr>
       <w:rPr>
-        <w:rFonts w:hint="default" w:ascii="Wingdings" w:hAnsi="Wingdings"/>
+        <w:rFonts w:ascii="Wingdings" w:hAnsi="Wingdings" w:hint="default"/>
         <w:sz w:val="20"/>
       </w:rPr>
     </w:lvl>
@@ -3114,7 +3332,7 @@
         <w:ind w:left="5040" w:hanging="360"/>
       </w:pPr>
       <w:rPr>
-        <w:rFonts w:hint="default" w:ascii="Wingdings" w:hAnsi="Wingdings"/>
+        <w:rFonts w:ascii="Wingdings" w:hAnsi="Wingdings" w:hint="default"/>
         <w:sz w:val="20"/>
       </w:rPr>
     </w:lvl>
@@ -3130,7 +3348,7 @@
         <w:ind w:left="5760" w:hanging="360"/>
       </w:pPr>
       <w:rPr>
-        <w:rFonts w:hint="default" w:ascii="Wingdings" w:hAnsi="Wingdings"/>
+        <w:rFonts w:ascii="Wingdings" w:hAnsi="Wingdings" w:hint="default"/>
         <w:sz w:val="20"/>
       </w:rPr>
     </w:lvl>
@@ -3146,7 +3364,7 @@
         <w:ind w:left="6480" w:hanging="360"/>
       </w:pPr>
       <w:rPr>
-        <w:rFonts w:hint="default" w:ascii="Wingdings" w:hAnsi="Wingdings"/>
+        <w:rFonts w:ascii="Wingdings" w:hAnsi="Wingdings" w:hint="default"/>
         <w:sz w:val="20"/>
       </w:rPr>
     </w:lvl>
@@ -3167,7 +3385,7 @@
         <w:ind w:left="720" w:hanging="360"/>
       </w:pPr>
       <w:rPr>
-        <w:rFonts w:hint="default" w:ascii="Symbol" w:hAnsi="Symbol"/>
+        <w:rFonts w:ascii="Symbol" w:hAnsi="Symbol" w:hint="default"/>
         <w:sz w:val="20"/>
       </w:rPr>
     </w:lvl>
@@ -3183,7 +3401,7 @@
         <w:ind w:left="1440" w:hanging="360"/>
       </w:pPr>
       <w:rPr>
-        <w:rFonts w:hint="default" w:ascii="Courier New" w:hAnsi="Courier New"/>
+        <w:rFonts w:ascii="Courier New" w:hAnsi="Courier New" w:hint="default"/>
         <w:sz w:val="20"/>
       </w:rPr>
     </w:lvl>
@@ -3199,7 +3417,7 @@
         <w:ind w:left="2160" w:hanging="360"/>
       </w:pPr>
       <w:rPr>
-        <w:rFonts w:hint="default" w:ascii="Wingdings" w:hAnsi="Wingdings"/>
+        <w:rFonts w:ascii="Wingdings" w:hAnsi="Wingdings" w:hint="default"/>
         <w:sz w:val="20"/>
       </w:rPr>
     </w:lvl>
@@ -3215,7 +3433,7 @@
         <w:ind w:left="2880" w:hanging="360"/>
       </w:pPr>
       <w:rPr>
-        <w:rFonts w:hint="default" w:ascii="Wingdings" w:hAnsi="Wingdings"/>
+        <w:rFonts w:ascii="Wingdings" w:hAnsi="Wingdings" w:hint="default"/>
         <w:sz w:val="20"/>
       </w:rPr>
     </w:lvl>
@@ -3231,7 +3449,7 @@
         <w:ind w:left="3600" w:hanging="360"/>
       </w:pPr>
       <w:rPr>
-        <w:rFonts w:hint="default" w:ascii="Wingdings" w:hAnsi="Wingdings"/>
+        <w:rFonts w:ascii="Wingdings" w:hAnsi="Wingdings" w:hint="default"/>
         <w:sz w:val="20"/>
       </w:rPr>
     </w:lvl>
@@ -3247,7 +3465,7 @@
         <w:ind w:left="4320" w:hanging="360"/>
       </w:pPr>
       <w:rPr>
-        <w:rFonts w:hint="default" w:ascii="Wingdings" w:hAnsi="Wingdings"/>
+        <w:rFonts w:ascii="Wingdings" w:hAnsi="Wingdings" w:hint="default"/>
         <w:sz w:val="20"/>
       </w:rPr>
     </w:lvl>
@@ -3263,7 +3481,7 @@
         <w:ind w:left="5040" w:hanging="360"/>
       </w:pPr>
       <w:rPr>
-        <w:rFonts w:hint="default" w:ascii="Wingdings" w:hAnsi="Wingdings"/>
+        <w:rFonts w:ascii="Wingdings" w:hAnsi="Wingdings" w:hint="default"/>
         <w:sz w:val="20"/>
       </w:rPr>
     </w:lvl>
@@ -3279,7 +3497,7 @@
         <w:ind w:left="5760" w:hanging="360"/>
       </w:pPr>
       <w:rPr>
-        <w:rFonts w:hint="default" w:ascii="Wingdings" w:hAnsi="Wingdings"/>
+        <w:rFonts w:ascii="Wingdings" w:hAnsi="Wingdings" w:hint="default"/>
         <w:sz w:val="20"/>
       </w:rPr>
     </w:lvl>
@@ -3295,7 +3513,7 @@
         <w:ind w:left="6480" w:hanging="360"/>
       </w:pPr>
       <w:rPr>
-        <w:rFonts w:hint="default" w:ascii="Wingdings" w:hAnsi="Wingdings"/>
+        <w:rFonts w:ascii="Wingdings" w:hAnsi="Wingdings" w:hint="default"/>
         <w:sz w:val="20"/>
       </w:rPr>
     </w:lvl>
@@ -3333,7 +3551,7 @@
         <w:ind w:left="1440" w:hanging="360"/>
       </w:pPr>
       <w:rPr>
-        <w:rFonts w:hint="default" w:ascii="Courier New" w:hAnsi="Courier New"/>
+        <w:rFonts w:ascii="Courier New" w:hAnsi="Courier New" w:hint="default"/>
         <w:sz w:val="20"/>
       </w:rPr>
     </w:lvl>
@@ -3349,7 +3567,7 @@
         <w:ind w:left="2160" w:hanging="360"/>
       </w:pPr>
       <w:rPr>
-        <w:rFonts w:hint="default" w:ascii="Wingdings" w:hAnsi="Wingdings"/>
+        <w:rFonts w:ascii="Wingdings" w:hAnsi="Wingdings" w:hint="default"/>
         <w:sz w:val="20"/>
       </w:rPr>
     </w:lvl>
@@ -3365,7 +3583,7 @@
         <w:ind w:left="2880" w:hanging="360"/>
       </w:pPr>
       <w:rPr>
-        <w:rFonts w:hint="default" w:ascii="Wingdings" w:hAnsi="Wingdings"/>
+        <w:rFonts w:ascii="Wingdings" w:hAnsi="Wingdings" w:hint="default"/>
         <w:sz w:val="20"/>
       </w:rPr>
     </w:lvl>
@@ -3381,7 +3599,7 @@
         <w:ind w:left="3600" w:hanging="360"/>
       </w:pPr>
       <w:rPr>
-        <w:rFonts w:hint="default" w:ascii="Wingdings" w:hAnsi="Wingdings"/>
+        <w:rFonts w:ascii="Wingdings" w:hAnsi="Wingdings" w:hint="default"/>
         <w:sz w:val="20"/>
       </w:rPr>
     </w:lvl>
@@ -3397,7 +3615,7 @@
         <w:ind w:left="4320" w:hanging="360"/>
       </w:pPr>
       <w:rPr>
-        <w:rFonts w:hint="default" w:ascii="Wingdings" w:hAnsi="Wingdings"/>
+        <w:rFonts w:ascii="Wingdings" w:hAnsi="Wingdings" w:hint="default"/>
         <w:sz w:val="20"/>
       </w:rPr>
     </w:lvl>
@@ -3413,7 +3631,7 @@
         <w:ind w:left="5040" w:hanging="360"/>
       </w:pPr>
       <w:rPr>
-        <w:rFonts w:hint="default" w:ascii="Wingdings" w:hAnsi="Wingdings"/>
+        <w:rFonts w:ascii="Wingdings" w:hAnsi="Wingdings" w:hint="default"/>
         <w:sz w:val="20"/>
       </w:rPr>
     </w:lvl>
@@ -3429,7 +3647,7 @@
         <w:ind w:left="5760" w:hanging="360"/>
       </w:pPr>
       <w:rPr>
-        <w:rFonts w:hint="default" w:ascii="Wingdings" w:hAnsi="Wingdings"/>
+        <w:rFonts w:ascii="Wingdings" w:hAnsi="Wingdings" w:hint="default"/>
         <w:sz w:val="20"/>
       </w:rPr>
     </w:lvl>
@@ -3445,7 +3663,7 @@
         <w:ind w:left="6480" w:hanging="360"/>
       </w:pPr>
       <w:rPr>
-        <w:rFonts w:hint="default" w:ascii="Wingdings" w:hAnsi="Wingdings"/>
+        <w:rFonts w:ascii="Wingdings" w:hAnsi="Wingdings" w:hint="default"/>
         <w:sz w:val="20"/>
       </w:rPr>
     </w:lvl>
@@ -3596,7 +3814,7 @@
         <w:ind w:left="1440" w:hanging="360"/>
       </w:pPr>
       <w:rPr>
-        <w:rFonts w:hint="default" w:ascii="Courier New" w:hAnsi="Courier New"/>
+        <w:rFonts w:ascii="Courier New" w:hAnsi="Courier New" w:hint="default"/>
         <w:sz w:val="20"/>
       </w:rPr>
     </w:lvl>
@@ -3612,7 +3830,7 @@
         <w:ind w:left="2160" w:hanging="360"/>
       </w:pPr>
       <w:rPr>
-        <w:rFonts w:hint="default" w:ascii="Wingdings" w:hAnsi="Wingdings"/>
+        <w:rFonts w:ascii="Wingdings" w:hAnsi="Wingdings" w:hint="default"/>
         <w:sz w:val="20"/>
       </w:rPr>
     </w:lvl>
@@ -3628,7 +3846,7 @@
         <w:ind w:left="2880" w:hanging="360"/>
       </w:pPr>
       <w:rPr>
-        <w:rFonts w:hint="default" w:ascii="Wingdings" w:hAnsi="Wingdings"/>
+        <w:rFonts w:ascii="Wingdings" w:hAnsi="Wingdings" w:hint="default"/>
         <w:sz w:val="20"/>
       </w:rPr>
     </w:lvl>
@@ -3644,7 +3862,7 @@
         <w:ind w:left="3600" w:hanging="360"/>
       </w:pPr>
       <w:rPr>
-        <w:rFonts w:hint="default" w:ascii="Wingdings" w:hAnsi="Wingdings"/>
+        <w:rFonts w:ascii="Wingdings" w:hAnsi="Wingdings" w:hint="default"/>
         <w:sz w:val="20"/>
       </w:rPr>
     </w:lvl>
@@ -3660,7 +3878,7 @@
         <w:ind w:left="4320" w:hanging="360"/>
       </w:pPr>
       <w:rPr>
-        <w:rFonts w:hint="default" w:ascii="Wingdings" w:hAnsi="Wingdings"/>
+        <w:rFonts w:ascii="Wingdings" w:hAnsi="Wingdings" w:hint="default"/>
         <w:sz w:val="20"/>
       </w:rPr>
     </w:lvl>
@@ -3676,7 +3894,7 @@
         <w:ind w:left="5040" w:hanging="360"/>
       </w:pPr>
       <w:rPr>
-        <w:rFonts w:hint="default" w:ascii="Wingdings" w:hAnsi="Wingdings"/>
+        <w:rFonts w:ascii="Wingdings" w:hAnsi="Wingdings" w:hint="default"/>
         <w:sz w:val="20"/>
       </w:rPr>
     </w:lvl>
@@ -3692,7 +3910,7 @@
         <w:ind w:left="5760" w:hanging="360"/>
       </w:pPr>
       <w:rPr>
-        <w:rFonts w:hint="default" w:ascii="Wingdings" w:hAnsi="Wingdings"/>
+        <w:rFonts w:ascii="Wingdings" w:hAnsi="Wingdings" w:hint="default"/>
         <w:sz w:val="20"/>
       </w:rPr>
     </w:lvl>
@@ -3708,7 +3926,7 @@
         <w:ind w:left="6480" w:hanging="360"/>
       </w:pPr>
       <w:rPr>
-        <w:rFonts w:hint="default" w:ascii="Wingdings" w:hAnsi="Wingdings"/>
+        <w:rFonts w:ascii="Wingdings" w:hAnsi="Wingdings" w:hint="default"/>
         <w:sz w:val="20"/>
       </w:rPr>
     </w:lvl>
@@ -3726,7 +3944,7 @@
         <w:ind w:left="720" w:hanging="360"/>
       </w:pPr>
       <w:rPr>
-        <w:rFonts w:hint="default" w:asciiTheme="minorHAnsi" w:hAnsiTheme="minorHAnsi" w:cstheme="minorHAnsi"/>
+        <w:rFonts w:asciiTheme="minorHAnsi" w:hAnsiTheme="minorHAnsi" w:cstheme="minorHAnsi" w:hint="default"/>
         <w:b w:val="0"/>
         <w:bCs w:val="0"/>
       </w:rPr>
@@ -3820,7 +4038,7 @@
         <w:ind w:left="720" w:hanging="360"/>
       </w:pPr>
       <w:rPr>
-        <w:rFonts w:hint="default" w:ascii="Symbol" w:hAnsi="Symbol"/>
+        <w:rFonts w:ascii="Symbol" w:hAnsi="Symbol" w:hint="default"/>
         <w:sz w:val="20"/>
       </w:rPr>
     </w:lvl>
@@ -3836,7 +4054,7 @@
         <w:ind w:left="1440" w:hanging="360"/>
       </w:pPr>
       <w:rPr>
-        <w:rFonts w:hint="default" w:ascii="Courier New" w:hAnsi="Courier New"/>
+        <w:rFonts w:ascii="Courier New" w:hAnsi="Courier New" w:hint="default"/>
         <w:sz w:val="20"/>
       </w:rPr>
     </w:lvl>
@@ -3852,7 +4070,7 @@
         <w:ind w:left="2160" w:hanging="360"/>
       </w:pPr>
       <w:rPr>
-        <w:rFonts w:hint="default" w:ascii="Wingdings" w:hAnsi="Wingdings"/>
+        <w:rFonts w:ascii="Wingdings" w:hAnsi="Wingdings" w:hint="default"/>
         <w:sz w:val="20"/>
       </w:rPr>
     </w:lvl>
@@ -3868,7 +4086,7 @@
         <w:ind w:left="2880" w:hanging="360"/>
       </w:pPr>
       <w:rPr>
-        <w:rFonts w:hint="default" w:ascii="Wingdings" w:hAnsi="Wingdings"/>
+        <w:rFonts w:ascii="Wingdings" w:hAnsi="Wingdings" w:hint="default"/>
         <w:sz w:val="20"/>
       </w:rPr>
     </w:lvl>
@@ -3884,7 +4102,7 @@
         <w:ind w:left="3600" w:hanging="360"/>
       </w:pPr>
       <w:rPr>
-        <w:rFonts w:hint="default" w:ascii="Wingdings" w:hAnsi="Wingdings"/>
+        <w:rFonts w:ascii="Wingdings" w:hAnsi="Wingdings" w:hint="default"/>
         <w:sz w:val="20"/>
       </w:rPr>
     </w:lvl>
@@ -3900,7 +4118,7 @@
         <w:ind w:left="4320" w:hanging="360"/>
       </w:pPr>
       <w:rPr>
-        <w:rFonts w:hint="default" w:ascii="Wingdings" w:hAnsi="Wingdings"/>
+        <w:rFonts w:ascii="Wingdings" w:hAnsi="Wingdings" w:hint="default"/>
         <w:sz w:val="20"/>
       </w:rPr>
     </w:lvl>
@@ -3916,7 +4134,7 @@
         <w:ind w:left="5040" w:hanging="360"/>
       </w:pPr>
       <w:rPr>
-        <w:rFonts w:hint="default" w:ascii="Wingdings" w:hAnsi="Wingdings"/>
+        <w:rFonts w:ascii="Wingdings" w:hAnsi="Wingdings" w:hint="default"/>
         <w:sz w:val="20"/>
       </w:rPr>
     </w:lvl>
@@ -3932,7 +4150,7 @@
         <w:ind w:left="5760" w:hanging="360"/>
       </w:pPr>
       <w:rPr>
-        <w:rFonts w:hint="default" w:ascii="Wingdings" w:hAnsi="Wingdings"/>
+        <w:rFonts w:ascii="Wingdings" w:hAnsi="Wingdings" w:hint="default"/>
         <w:sz w:val="20"/>
       </w:rPr>
     </w:lvl>
@@ -3948,7 +4166,7 @@
         <w:ind w:left="6480" w:hanging="360"/>
       </w:pPr>
       <w:rPr>
-        <w:rFonts w:hint="default" w:ascii="Wingdings" w:hAnsi="Wingdings"/>
+        <w:rFonts w:ascii="Wingdings" w:hAnsi="Wingdings" w:hint="default"/>
         <w:sz w:val="20"/>
       </w:rPr>
     </w:lvl>
@@ -4086,7 +4304,7 @@
   <w:docDefaults>
     <w:rPrDefault>
       <w:rPr>
-        <w:rFonts w:asciiTheme="minorHAnsi" w:hAnsiTheme="minorHAnsi" w:eastAsiaTheme="minorHAnsi" w:cstheme="minorBidi"/>
+        <w:rFonts w:asciiTheme="minorHAnsi" w:eastAsiaTheme="minorHAnsi" w:hAnsiTheme="minorHAnsi" w:cstheme="minorBidi"/>
         <w:sz w:val="24"/>
         <w:szCs w:val="24"/>
         <w:lang w:val="en-US" w:eastAsia="en-US" w:bidi="ar-SA"/>
@@ -4097,14 +4315,14 @@
   <w:latentStyles w:defLockedState="0" w:defUIPriority="99" w:defSemiHidden="0" w:defUnhideWhenUsed="0" w:defQFormat="0" w:count="376">
     <w:lsdException w:name="Normal" w:uiPriority="0" w:qFormat="1"/>
     <w:lsdException w:name="heading 1" w:uiPriority="9" w:qFormat="1"/>
-    <w:lsdException w:name="heading 2" w:uiPriority="9" w:semiHidden="1" w:unhideWhenUsed="1" w:qFormat="1"/>
-    <w:lsdException w:name="heading 3" w:uiPriority="9" w:semiHidden="1" w:unhideWhenUsed="1" w:qFormat="1"/>
-    <w:lsdException w:name="heading 4" w:uiPriority="9" w:semiHidden="1" w:unhideWhenUsed="1" w:qFormat="1"/>
-    <w:lsdException w:name="heading 5" w:uiPriority="9" w:semiHidden="1" w:unhideWhenUsed="1" w:qFormat="1"/>
-    <w:lsdException w:name="heading 6" w:uiPriority="9" w:semiHidden="1" w:unhideWhenUsed="1" w:qFormat="1"/>
-    <w:lsdException w:name="heading 7" w:uiPriority="9" w:semiHidden="1" w:unhideWhenUsed="1" w:qFormat="1"/>
-    <w:lsdException w:name="heading 8" w:uiPriority="9" w:semiHidden="1" w:unhideWhenUsed="1" w:qFormat="1"/>
-    <w:lsdException w:name="heading 9" w:uiPriority="9" w:semiHidden="1" w:unhideWhenUsed="1" w:qFormat="1"/>
+    <w:lsdException w:name="heading 2" w:semiHidden="1" w:uiPriority="9" w:unhideWhenUsed="1" w:qFormat="1"/>
+    <w:lsdException w:name="heading 3" w:semiHidden="1" w:uiPriority="9" w:unhideWhenUsed="1" w:qFormat="1"/>
+    <w:lsdException w:name="heading 4" w:semiHidden="1" w:uiPriority="9" w:unhideWhenUsed="1" w:qFormat="1"/>
+    <w:lsdException w:name="heading 5" w:semiHidden="1" w:uiPriority="9" w:unhideWhenUsed="1" w:qFormat="1"/>
+    <w:lsdException w:name="heading 6" w:semiHidden="1" w:uiPriority="9" w:unhideWhenUsed="1" w:qFormat="1"/>
+    <w:lsdException w:name="heading 7" w:semiHidden="1" w:uiPriority="9" w:unhideWhenUsed="1" w:qFormat="1"/>
+    <w:lsdException w:name="heading 8" w:semiHidden="1" w:uiPriority="9" w:unhideWhenUsed="1" w:qFormat="1"/>
+    <w:lsdException w:name="heading 9" w:semiHidden="1" w:uiPriority="9" w:unhideWhenUsed="1" w:qFormat="1"/>
     <w:lsdException w:name="index 1" w:semiHidden="1" w:unhideWhenUsed="1"/>
     <w:lsdException w:name="index 2" w:semiHidden="1" w:unhideWhenUsed="1"/>
     <w:lsdException w:name="index 3" w:semiHidden="1" w:unhideWhenUsed="1"/>
@@ -4114,22 +4332,22 @@
     <w:lsdException w:name="index 7" w:semiHidden="1" w:unhideWhenUsed="1"/>
     <w:lsdException w:name="index 8" w:semiHidden="1" w:unhideWhenUsed="1"/>
     <w:lsdException w:name="index 9" w:semiHidden="1" w:unhideWhenUsed="1"/>
-    <w:lsdException w:name="toc 1" w:uiPriority="39" w:semiHidden="1" w:unhideWhenUsed="1"/>
-    <w:lsdException w:name="toc 2" w:uiPriority="39" w:semiHidden="1" w:unhideWhenUsed="1"/>
-    <w:lsdException w:name="toc 3" w:uiPriority="39" w:semiHidden="1" w:unhideWhenUsed="1"/>
-    <w:lsdException w:name="toc 4" w:uiPriority="39" w:semiHidden="1" w:unhideWhenUsed="1"/>
-    <w:lsdException w:name="toc 5" w:uiPriority="39" w:semiHidden="1" w:unhideWhenUsed="1"/>
-    <w:lsdException w:name="toc 6" w:uiPriority="39" w:semiHidden="1" w:unhideWhenUsed="1"/>
-    <w:lsdException w:name="toc 7" w:uiPriority="39" w:semiHidden="1" w:unhideWhenUsed="1"/>
-    <w:lsdException w:name="toc 8" w:uiPriority="39" w:semiHidden="1" w:unhideWhenUsed="1"/>
-    <w:lsdException w:name="toc 9" w:uiPriority="39" w:semiHidden="1" w:unhideWhenUsed="1"/>
+    <w:lsdException w:name="toc 1" w:semiHidden="1" w:uiPriority="39" w:unhideWhenUsed="1"/>
+    <w:lsdException w:name="toc 2" w:semiHidden="1" w:uiPriority="39" w:unhideWhenUsed="1"/>
+    <w:lsdException w:name="toc 3" w:semiHidden="1" w:uiPriority="39" w:unhideWhenUsed="1"/>
+    <w:lsdException w:name="toc 4" w:semiHidden="1" w:uiPriority="39" w:unhideWhenUsed="1"/>
+    <w:lsdException w:name="toc 5" w:semiHidden="1" w:uiPriority="39" w:unhideWhenUsed="1"/>
+    <w:lsdException w:name="toc 6" w:semiHidden="1" w:uiPriority="39" w:unhideWhenUsed="1"/>
+    <w:lsdException w:name="toc 7" w:semiHidden="1" w:uiPriority="39" w:unhideWhenUsed="1"/>
+    <w:lsdException w:name="toc 8" w:semiHidden="1" w:uiPriority="39" w:unhideWhenUsed="1"/>
+    <w:lsdException w:name="toc 9" w:semiHidden="1" w:uiPriority="39" w:unhideWhenUsed="1"/>
     <w:lsdException w:name="Normal Indent" w:semiHidden="1" w:unhideWhenUsed="1"/>
     <w:lsdException w:name="footnote text" w:semiHidden="1" w:unhideWhenUsed="1"/>
     <w:lsdException w:name="annotation text" w:semiHidden="1" w:unhideWhenUsed="1"/>
     <w:lsdException w:name="header" w:semiHidden="1" w:unhideWhenUsed="1"/>
     <w:lsdException w:name="footer" w:semiHidden="1" w:unhideWhenUsed="1"/>
     <w:lsdException w:name="index heading" w:semiHidden="1" w:unhideWhenUsed="1"/>
-    <w:lsdException w:name="caption" w:uiPriority="35" w:semiHidden="1" w:unhideWhenUsed="1" w:qFormat="1"/>
+    <w:lsdException w:name="caption" w:semiHidden="1" w:uiPriority="35" w:unhideWhenUsed="1" w:qFormat="1"/>
     <w:lsdException w:name="table of figures" w:semiHidden="1" w:unhideWhenUsed="1"/>
     <w:lsdException w:name="envelope address" w:semiHidden="1" w:unhideWhenUsed="1"/>
     <w:lsdException w:name="envelope return" w:semiHidden="1" w:unhideWhenUsed="1"/>
@@ -4160,7 +4378,7 @@
     <w:lsdException w:name="Title" w:uiPriority="10" w:qFormat="1"/>
     <w:lsdException w:name="Closing" w:semiHidden="1" w:unhideWhenUsed="1"/>
     <w:lsdException w:name="Signature" w:semiHidden="1" w:unhideWhenUsed="1"/>
-    <w:lsdException w:name="Default Paragraph Font" w:uiPriority="1" w:semiHidden="1" w:unhideWhenUsed="1"/>
+    <w:lsdException w:name="Default Paragraph Font" w:semiHidden="1" w:uiPriority="1" w:unhideWhenUsed="1"/>
     <w:lsdException w:name="Body Text" w:semiHidden="1" w:unhideWhenUsed="1"/>
     <w:lsdException w:name="Body Text Indent" w:semiHidden="1" w:unhideWhenUsed="1"/>
     <w:lsdException w:name="List Continue" w:semiHidden="1" w:unhideWhenUsed="1"/>
@@ -4360,8 +4578,8 @@
     <w:lsdException w:name="Subtle Reference" w:uiPriority="31" w:qFormat="1"/>
     <w:lsdException w:name="Intense Reference" w:uiPriority="32" w:qFormat="1"/>
     <w:lsdException w:name="Book Title" w:uiPriority="33" w:qFormat="1"/>
-    <w:lsdException w:name="Bibliography" w:uiPriority="37" w:semiHidden="1" w:unhideWhenUsed="1"/>
-    <w:lsdException w:name="TOC Heading" w:uiPriority="39" w:semiHidden="1" w:unhideWhenUsed="1" w:qFormat="1"/>
+    <w:lsdException w:name="Bibliography" w:semiHidden="1" w:uiPriority="37" w:unhideWhenUsed="1"/>
+    <w:lsdException w:name="TOC Heading" w:semiHidden="1" w:uiPriority="39" w:unhideWhenUsed="1" w:qFormat="1"/>
     <w:lsdException w:name="Plain Table 1" w:uiPriority="41"/>
     <w:lsdException w:name="Plain Table 2" w:uiPriority="42"/>
     <w:lsdException w:name="Plain Table 3" w:uiPriority="43"/>
@@ -4469,7 +4687,7 @@
     <w:lsdException w:name="Mention" w:semiHidden="1" w:unhideWhenUsed="1"/>
     <w:lsdException w:name="Smart Hyperlink" w:semiHidden="1" w:unhideWhenUsed="1"/>
   </w:latentStyles>
-  <w:style w:type="paragraph" w:styleId="Normal" w:default="1">
+  <w:style w:type="paragraph" w:default="1" w:styleId="Normal">
     <w:name w:val="Normal"/>
     <w:qFormat/>
     <w:rsid w:val="00560AD0"/>
@@ -4477,7 +4695,7 @@
       <w:spacing w:before="120" w:after="120"/>
     </w:pPr>
     <w:rPr>
-      <w:rFonts w:ascii="Calibri" w:hAnsi="Calibri" w:eastAsia="Times New Roman" w:cs="Times New Roman"/>
+      <w:rFonts w:ascii="Calibri" w:eastAsia="Times New Roman" w:hAnsi="Calibri" w:cs="Times New Roman"/>
       <w:sz w:val="22"/>
       <w:szCs w:val="22"/>
     </w:rPr>
@@ -4497,7 +4715,7 @@
       <w:outlineLvl w:val="0"/>
     </w:pPr>
     <w:rPr>
-      <w:rFonts w:asciiTheme="majorHAnsi" w:hAnsiTheme="majorHAnsi" w:eastAsiaTheme="majorEastAsia" w:cstheme="majorBidi"/>
+      <w:rFonts w:asciiTheme="majorHAnsi" w:eastAsiaTheme="majorEastAsia" w:hAnsiTheme="majorHAnsi" w:cstheme="majorBidi"/>
       <w:color w:val="2F5496" w:themeColor="accent1" w:themeShade="BF"/>
       <w:sz w:val="32"/>
       <w:szCs w:val="32"/>
@@ -4519,7 +4737,7 @@
       <w:outlineLvl w:val="1"/>
     </w:pPr>
     <w:rPr>
-      <w:rFonts w:asciiTheme="majorHAnsi" w:hAnsiTheme="majorHAnsi" w:eastAsiaTheme="majorEastAsia" w:cstheme="majorBidi"/>
+      <w:rFonts w:asciiTheme="majorHAnsi" w:eastAsiaTheme="majorEastAsia" w:hAnsiTheme="majorHAnsi" w:cstheme="majorBidi"/>
       <w:color w:val="2F5496" w:themeColor="accent1" w:themeShade="BF"/>
       <w:sz w:val="26"/>
       <w:szCs w:val="26"/>
@@ -4542,16 +4760,16 @@
       <w:outlineLvl w:val="2"/>
     </w:pPr>
     <w:rPr>
-      <w:rFonts w:asciiTheme="majorHAnsi" w:hAnsiTheme="majorHAnsi" w:eastAsiaTheme="majorEastAsia" w:cstheme="majorBidi"/>
+      <w:rFonts w:asciiTheme="majorHAnsi" w:eastAsiaTheme="majorEastAsia" w:hAnsiTheme="majorHAnsi" w:cstheme="majorBidi"/>
       <w:color w:val="1F3763" w:themeColor="accent1" w:themeShade="7F"/>
     </w:rPr>
   </w:style>
-  <w:style w:type="character" w:styleId="DefaultParagraphFont" w:default="1">
+  <w:style w:type="character" w:default="1" w:styleId="DefaultParagraphFont">
     <w:name w:val="Default Paragraph Font"/>
     <w:uiPriority w:val="1"/>
     <w:unhideWhenUsed/>
   </w:style>
-  <w:style w:type="table" w:styleId="TableNormal" w:default="1">
+  <w:style w:type="table" w:default="1" w:styleId="TableNormal">
     <w:name w:val="Normal Table"/>
     <w:uiPriority w:val="99"/>
     <w:semiHidden/>
@@ -4566,7 +4784,7 @@
       </w:tblCellMar>
     </w:tblPr>
   </w:style>
-  <w:style w:type="numbering" w:styleId="NoList" w:default="1">
+  <w:style w:type="numbering" w:default="1" w:styleId="NoList">
     <w:name w:val="No List"/>
     <w:uiPriority w:val="99"/>
     <w:semiHidden/>
@@ -4616,35 +4834,35 @@
       <w:contextualSpacing/>
     </w:pPr>
     <w:rPr>
-      <w:rFonts w:asciiTheme="majorHAnsi" w:hAnsiTheme="majorHAnsi" w:eastAsiaTheme="majorEastAsia" w:cstheme="majorBidi"/>
+      <w:rFonts w:asciiTheme="majorHAnsi" w:eastAsiaTheme="majorEastAsia" w:hAnsiTheme="majorHAnsi" w:cstheme="majorBidi"/>
       <w:spacing w:val="-10"/>
       <w:kern w:val="28"/>
       <w:sz w:val="56"/>
       <w:szCs w:val="56"/>
     </w:rPr>
   </w:style>
-  <w:style w:type="character" w:styleId="TitleChar" w:customStyle="1">
+  <w:style w:type="character" w:customStyle="1" w:styleId="TitleChar">
     <w:name w:val="Title Char"/>
     <w:basedOn w:val="DefaultParagraphFont"/>
     <w:link w:val="Title"/>
     <w:uiPriority w:val="10"/>
     <w:rsid w:val="004E7A88"/>
     <w:rPr>
-      <w:rFonts w:asciiTheme="majorHAnsi" w:hAnsiTheme="majorHAnsi" w:eastAsiaTheme="majorEastAsia" w:cstheme="majorBidi"/>
+      <w:rFonts w:asciiTheme="majorHAnsi" w:eastAsiaTheme="majorEastAsia" w:hAnsiTheme="majorHAnsi" w:cstheme="majorBidi"/>
       <w:spacing w:val="-10"/>
       <w:kern w:val="28"/>
       <w:sz w:val="56"/>
       <w:szCs w:val="56"/>
     </w:rPr>
   </w:style>
-  <w:style w:type="character" w:styleId="Heading2Char" w:customStyle="1">
+  <w:style w:type="character" w:customStyle="1" w:styleId="Heading2Char">
     <w:name w:val="Heading 2 Char"/>
     <w:basedOn w:val="DefaultParagraphFont"/>
     <w:link w:val="Heading2"/>
     <w:uiPriority w:val="9"/>
     <w:rsid w:val="004E7A88"/>
     <w:rPr>
-      <w:rFonts w:asciiTheme="majorHAnsi" w:hAnsiTheme="majorHAnsi" w:eastAsiaTheme="majorEastAsia" w:cstheme="majorBidi"/>
+      <w:rFonts w:asciiTheme="majorHAnsi" w:eastAsiaTheme="majorEastAsia" w:hAnsiTheme="majorHAnsi" w:cstheme="majorBidi"/>
       <w:color w:val="2F5496" w:themeColor="accent1" w:themeShade="BF"/>
       <w:sz w:val="26"/>
       <w:szCs w:val="26"/>
@@ -4660,14 +4878,14 @@
       <w:szCs w:val="22"/>
     </w:rPr>
   </w:style>
-  <w:style w:type="character" w:styleId="Heading1Char" w:customStyle="1">
+  <w:style w:type="character" w:customStyle="1" w:styleId="Heading1Char">
     <w:name w:val="Heading 1 Char"/>
     <w:basedOn w:val="DefaultParagraphFont"/>
     <w:link w:val="Heading1"/>
     <w:uiPriority w:val="9"/>
     <w:rsid w:val="004E7A88"/>
     <w:rPr>
-      <w:rFonts w:asciiTheme="majorHAnsi" w:hAnsiTheme="majorHAnsi" w:eastAsiaTheme="majorEastAsia" w:cstheme="majorBidi"/>
+      <w:rFonts w:asciiTheme="majorHAnsi" w:eastAsiaTheme="majorEastAsia" w:hAnsiTheme="majorHAnsi" w:cstheme="majorBidi"/>
       <w:color w:val="2F5496" w:themeColor="accent1" w:themeShade="BF"/>
       <w:sz w:val="32"/>
       <w:szCs w:val="32"/>
@@ -4685,7 +4903,7 @@
       <w:u w:val="single"/>
     </w:rPr>
   </w:style>
-  <w:style w:type="paragraph" w:styleId="Command-linesyntax" w:customStyle="1">
+  <w:style w:type="paragraph" w:customStyle="1" w:styleId="Command-linesyntax">
     <w:name w:val="Command-line syntax"/>
     <w:basedOn w:val="ListParagraph"/>
     <w:uiPriority w:val="99"/>
@@ -4693,17 +4911,17 @@
     <w:rsid w:val="00560AD0"/>
     <w:pPr>
       <w:pBdr>
-        <w:top w:val="single" w:color="F1F3F4" w:sz="4" w:space="10"/>
-        <w:left w:val="single" w:color="F1F3F4" w:sz="4" w:space="10"/>
-        <w:bottom w:val="single" w:color="F1F3F4" w:sz="4" w:space="10"/>
-        <w:right w:val="single" w:color="F1F3F4" w:sz="4" w:space="10"/>
+        <w:top w:val="single" w:sz="4" w:space="10" w:color="F1F3F4"/>
+        <w:left w:val="single" w:sz="4" w:space="10" w:color="F1F3F4"/>
+        <w:bottom w:val="single" w:sz="4" w:space="10" w:color="F1F3F4"/>
+        <w:right w:val="single" w:sz="4" w:space="10" w:color="F1F3F4"/>
       </w:pBdr>
       <w:shd w:val="clear" w:color="auto" w:fill="F1F3F4"/>
       <w:ind w:left="990"/>
       <w:contextualSpacing w:val="0"/>
     </w:pPr>
     <w:rPr>
-      <w:rFonts w:ascii="Consolas" w:hAnsi="Consolas" w:eastAsiaTheme="minorHAnsi" w:cstheme="minorBidi"/>
+      <w:rFonts w:ascii="Consolas" w:eastAsiaTheme="minorHAnsi" w:hAnsi="Consolas" w:cstheme="minorBidi"/>
       <w:color w:val="404040" w:themeColor="text1" w:themeTint="BF"/>
       <w:shd w:val="clear" w:color="auto" w:fill="F1F3F4"/>
     </w:rPr>
@@ -4732,14 +4950,14 @@
       <w:szCs w:val="20"/>
     </w:rPr>
   </w:style>
-  <w:style w:type="character" w:styleId="CommentTextChar" w:customStyle="1">
+  <w:style w:type="character" w:customStyle="1" w:styleId="CommentTextChar">
     <w:name w:val="Comment Text Char"/>
     <w:basedOn w:val="DefaultParagraphFont"/>
     <w:link w:val="CommentText"/>
     <w:uiPriority w:val="99"/>
     <w:rsid w:val="00BD740C"/>
     <w:rPr>
-      <w:rFonts w:ascii="Times New Roman" w:hAnsi="Times New Roman" w:eastAsia="Times New Roman" w:cs="Times New Roman"/>
+      <w:rFonts w:ascii="Times New Roman" w:eastAsia="Times New Roman" w:hAnsi="Times New Roman" w:cs="Times New Roman"/>
       <w:sz w:val="20"/>
       <w:szCs w:val="20"/>
     </w:rPr>
@@ -4758,7 +4976,7 @@
       <w:bCs/>
     </w:rPr>
   </w:style>
-  <w:style w:type="character" w:styleId="CommentSubjectChar" w:customStyle="1">
+  <w:style w:type="character" w:customStyle="1" w:styleId="CommentSubjectChar">
     <w:name w:val="Comment Subject Char"/>
     <w:basedOn w:val="CommentTextChar"/>
     <w:link w:val="CommentSubject"/>
@@ -4766,7 +4984,7 @@
     <w:semiHidden/>
     <w:rsid w:val="00BD740C"/>
     <w:rPr>
-      <w:rFonts w:ascii="Times New Roman" w:hAnsi="Times New Roman" w:eastAsia="Times New Roman" w:cs="Times New Roman"/>
+      <w:rFonts w:ascii="Times New Roman" w:eastAsia="Times New Roman" w:hAnsi="Times New Roman" w:cs="Times New Roman"/>
       <w:b/>
       <w:bCs/>
       <w:sz w:val="20"/>
@@ -4787,7 +5005,7 @@
       <w:szCs w:val="18"/>
     </w:rPr>
   </w:style>
-  <w:style w:type="character" w:styleId="BalloonTextChar" w:customStyle="1">
+  <w:style w:type="character" w:customStyle="1" w:styleId="BalloonTextChar">
     <w:name w:val="Balloon Text Char"/>
     <w:basedOn w:val="DefaultParagraphFont"/>
     <w:link w:val="BalloonText"/>
@@ -4795,7 +5013,7 @@
     <w:semiHidden/>
     <w:rsid w:val="00BD740C"/>
     <w:rPr>
-      <w:rFonts w:ascii="Segoe UI" w:hAnsi="Segoe UI" w:eastAsia="Times New Roman" w:cs="Segoe UI"/>
+      <w:rFonts w:ascii="Segoe UI" w:eastAsia="Times New Roman" w:hAnsi="Segoe UI" w:cs="Segoe UI"/>
       <w:sz w:val="18"/>
       <w:szCs w:val="18"/>
     </w:rPr>
@@ -4844,7 +5062,7 @@
       <w:szCs w:val="20"/>
     </w:rPr>
   </w:style>
-  <w:style w:type="character" w:styleId="HTMLPreformattedChar" w:customStyle="1">
+  <w:style w:type="character" w:customStyle="1" w:styleId="HTMLPreformattedChar">
     <w:name w:val="HTML Preformatted Char"/>
     <w:basedOn w:val="DefaultParagraphFont"/>
     <w:link w:val="HTMLPreformatted"/>
@@ -4852,7 +5070,7 @@
     <w:semiHidden/>
     <w:rsid w:val="00C07926"/>
     <w:rPr>
-      <w:rFonts w:ascii="Courier New" w:hAnsi="Courier New" w:eastAsia="Times New Roman" w:cs="Courier New"/>
+      <w:rFonts w:ascii="Courier New" w:eastAsia="Times New Roman" w:hAnsi="Courier New" w:cs="Courier New"/>
       <w:sz w:val="20"/>
       <w:szCs w:val="20"/>
     </w:rPr>
@@ -4868,7 +5086,7 @@
       <w:bCs/>
     </w:rPr>
   </w:style>
-  <w:style w:type="character" w:styleId="Heading3Char" w:customStyle="1">
+  <w:style w:type="character" w:customStyle="1" w:styleId="Heading3Char">
     <w:name w:val="Heading 3 Char"/>
     <w:basedOn w:val="DefaultParagraphFont"/>
     <w:link w:val="Heading3"/>
@@ -4876,7 +5094,7 @@
     <w:semiHidden/>
     <w:rsid w:val="00C07926"/>
     <w:rPr>
-      <w:rFonts w:asciiTheme="majorHAnsi" w:hAnsiTheme="majorHAnsi" w:eastAsiaTheme="majorEastAsia" w:cstheme="majorBidi"/>
+      <w:rFonts w:asciiTheme="majorHAnsi" w:eastAsiaTheme="majorEastAsia" w:hAnsiTheme="majorHAnsi" w:cstheme="majorBidi"/>
       <w:color w:val="1F3763" w:themeColor="accent1" w:themeShade="7F"/>
     </w:rPr>
   </w:style>
@@ -4891,7 +5109,7 @@
       <w:iCs/>
     </w:rPr>
   </w:style>
-  <w:style w:type="paragraph" w:styleId="ic-flash-info" w:customStyle="1">
+  <w:style w:type="paragraph" w:customStyle="1" w:styleId="ic-flash-info">
     <w:name w:val="ic-flash-info"/>
     <w:basedOn w:val="Normal"/>
     <w:rsid w:val="00C07926"/>
@@ -4919,12 +5137,12 @@
     <w:unhideWhenUsed/>
     <w:rsid w:val="00AA1954"/>
     <w:rPr>
-      <w:rFonts w:ascii="Courier New" w:hAnsi="Courier New" w:eastAsia="Times New Roman" w:cs="Courier New"/>
+      <w:rFonts w:ascii="Courier New" w:eastAsia="Times New Roman" w:hAnsi="Courier New" w:cs="Courier New"/>
       <w:sz w:val="20"/>
       <w:szCs w:val="20"/>
     </w:rPr>
   </w:style>
-  <w:style w:type="character" w:styleId="In-LineCommandSyntax" w:customStyle="1">
+  <w:style w:type="character" w:customStyle="1" w:styleId="In-LineCommandSyntax">
     <w:name w:val="In-Line Command Syntax"/>
     <w:basedOn w:val="DefaultParagraphFont"/>
     <w:uiPriority w:val="1"/>
@@ -4934,11 +5152,11 @@
       <w:rFonts w:ascii="Consolas" w:hAnsi="Consolas"/>
       <w:color w:val="404040" w:themeColor="text1" w:themeTint="BF"/>
       <w:sz w:val="22"/>
-      <w:bdr w:val="none" w:color="auto" w:sz="0" w:space="0"/>
+      <w:bdr w:val="none" w:sz="0" w:space="0" w:color="auto"/>
       <w:shd w:val="clear" w:color="auto" w:fill="F1F3F4"/>
     </w:rPr>
   </w:style>
-  <w:style w:type="paragraph" w:styleId="PythonComment" w:customStyle="1">
+  <w:style w:type="paragraph" w:customStyle="1" w:styleId="PythonComment">
     <w:name w:val="PythonComment"/>
     <w:basedOn w:val="Command-linesyntax"/>
     <w:qFormat/>
@@ -4964,14 +5182,14 @@
       <w:spacing w:before="0" w:after="0"/>
     </w:pPr>
   </w:style>
-  <w:style w:type="character" w:styleId="HeaderChar" w:customStyle="1">
+  <w:style w:type="character" w:customStyle="1" w:styleId="HeaderChar">
     <w:name w:val="Header Char"/>
     <w:basedOn w:val="DefaultParagraphFont"/>
     <w:link w:val="Header"/>
     <w:uiPriority w:val="99"/>
     <w:rsid w:val="00560AD0"/>
     <w:rPr>
-      <w:rFonts w:ascii="Calibri" w:hAnsi="Calibri" w:eastAsia="Times New Roman" w:cs="Times New Roman"/>
+      <w:rFonts w:ascii="Calibri" w:eastAsia="Times New Roman" w:hAnsi="Calibri" w:cs="Times New Roman"/>
       <w:sz w:val="22"/>
       <w:szCs w:val="22"/>
     </w:rPr>
@@ -4991,14 +5209,14 @@
       <w:spacing w:before="0" w:after="0"/>
     </w:pPr>
   </w:style>
-  <w:style w:type="character" w:styleId="FooterChar" w:customStyle="1">
+  <w:style w:type="character" w:customStyle="1" w:styleId="FooterChar">
     <w:name w:val="Footer Char"/>
     <w:basedOn w:val="DefaultParagraphFont"/>
     <w:link w:val="Footer"/>
     <w:uiPriority w:val="99"/>
     <w:rsid w:val="00560AD0"/>
     <w:rPr>
-      <w:rFonts w:ascii="Calibri" w:hAnsi="Calibri" w:eastAsia="Times New Roman" w:cs="Times New Roman"/>
+      <w:rFonts w:ascii="Calibri" w:eastAsia="Times New Roman" w:hAnsi="Calibri" w:cs="Times New Roman"/>
       <w:sz w:val="22"/>
       <w:szCs w:val="22"/>
     </w:rPr>
@@ -5015,12 +5233,12 @@
     </w:rPr>
     <w:tblPr>
       <w:tblBorders>
-        <w:top w:val="single" w:color="auto" w:sz="4" w:space="0"/>
-        <w:left w:val="single" w:color="auto" w:sz="4" w:space="0"/>
-        <w:bottom w:val="single" w:color="auto" w:sz="4" w:space="0"/>
-        <w:right w:val="single" w:color="auto" w:sz="4" w:space="0"/>
-        <w:insideH w:val="single" w:color="auto" w:sz="4" w:space="0"/>
-        <w:insideV w:val="single" w:color="auto" w:sz="4" w:space="0"/>
+        <w:top w:val="single" w:sz="4" w:space="0" w:color="auto"/>
+        <w:left w:val="single" w:sz="4" w:space="0" w:color="auto"/>
+        <w:bottom w:val="single" w:sz="4" w:space="0" w:color="auto"/>
+        <w:right w:val="single" w:sz="4" w:space="0" w:color="auto"/>
+        <w:insideH w:val="single" w:sz="4" w:space="0" w:color="auto"/>
+        <w:insideV w:val="single" w:sz="4" w:space="0" w:color="auto"/>
       </w:tblBorders>
     </w:tblPr>
   </w:style>
@@ -5028,7 +5246,7 @@
 </file>
 
 <file path=word/theme/theme1.xml><?xml version="1.0" encoding="utf-8"?>
-<a:theme xmlns:a="http://schemas.openxmlformats.org/drawingml/2006/main" xmlns:thm15="http://schemas.microsoft.com/office/thememl/2012/main" name="Office Theme">
+<a:theme xmlns:a="http://schemas.openxmlformats.org/drawingml/2006/main" name="Office Theme">
   <a:themeElements>
     <a:clrScheme name="Office">
       <a:dk1>
@@ -5289,15 +5507,6 @@
 </file>
 
 <file path=customXml/item1.xml><?xml version="1.0" encoding="utf-8"?>
-<?mso-contentType ?>
-<FormTemplates xmlns="http://schemas.microsoft.com/sharepoint/v3/contenttype/forms">
-  <Display>DocumentLibraryForm</Display>
-  <Edit>DocumentLibraryForm</Edit>
-  <New>DocumentLibraryForm</New>
-</FormTemplates>
-</file>
-
-<file path=customXml/item2.xml><?xml version="1.0" encoding="utf-8"?>
 <ct:contentTypeSchema xmlns:ct="http://schemas.microsoft.com/office/2006/metadata/contentType" xmlns:ma="http://schemas.microsoft.com/office/2006/metadata/properties/metaAttributes" ct:_="" ma:_="" ma:contentTypeName="Document" ma:contentTypeID="0x0101009773663AEC73F64CB9310C74F592BBA1" ma:contentTypeVersion="20" ma:contentTypeDescription="Create a new document." ma:contentTypeScope="" ma:versionID="e3e8b90736fa3c18777bedfc6932e7e2">
   <xsd:schema xmlns:xsd="http://www.w3.org/2001/XMLSchema" xmlns:xs="http://www.w3.org/2001/XMLSchema" xmlns:p="http://schemas.microsoft.com/office/2006/metadata/properties" xmlns:ns2="c6c77d8f-09f6-4e2b-8f47-31ad1c0144f5" xmlns:ns3="146bd9e1-3fdb-4f50-9526-c68c2343cb8e" targetNamespace="http://schemas.microsoft.com/office/2006/metadata/properties" ma:root="true" ma:fieldsID="f3d43b72e653855ae0c6376ccd179cb7" ns2:_="" ns3:_="">
     <xsd:import namespace="c6c77d8f-09f6-4e2b-8f47-31ad1c0144f5"/>
@@ -5564,7 +5773,7 @@
 </ct:contentTypeSchema>
 </file>
 
-<file path=customXml/item3.xml><?xml version="1.0" encoding="utf-8"?>
+<file path=customXml/item2.xml><?xml version="1.0" encoding="utf-8"?>
 <p:properties xmlns:p="http://schemas.microsoft.com/office/2006/metadata/properties" xmlns:xsi="http://www.w3.org/2001/XMLSchema-instance" xmlns:pc="http://schemas.microsoft.com/office/infopath/2007/PartnerControls">
   <documentManagement>
     <Preview xmlns="c6c77d8f-09f6-4e2b-8f47-31ad1c0144f5" xsi:nil="true"/>
@@ -5576,15 +5785,16 @@
 </p:properties>
 </file>
 
-<file path=customXml/itemProps1.xml><?xml version="1.0" encoding="utf-8"?>
-<ds:datastoreItem xmlns:ds="http://schemas.openxmlformats.org/officeDocument/2006/customXml" ds:itemID="{77991735-DCD3-45B1-A011-77EB6015DA17}">
-  <ds:schemaRefs>
-    <ds:schemaRef ds:uri="http://schemas.microsoft.com/sharepoint/v3/contenttype/forms"/>
-  </ds:schemaRefs>
-</ds:datastoreItem>
+<file path=customXml/item3.xml><?xml version="1.0" encoding="utf-8"?>
+<?mso-contentType ?>
+<FormTemplates xmlns="http://schemas.microsoft.com/sharepoint/v3/contenttype/forms">
+  <Display>DocumentLibraryForm</Display>
+  <Edit>DocumentLibraryForm</Edit>
+  <New>DocumentLibraryForm</New>
+</FormTemplates>
 </file>
 
-<file path=customXml/itemProps2.xml><?xml version="1.0" encoding="utf-8"?>
+<file path=customXml/itemProps1.xml><?xml version="1.0" encoding="utf-8"?>
 <ds:datastoreItem xmlns:ds="http://schemas.openxmlformats.org/officeDocument/2006/customXml" ds:itemID="{A84CBB92-4E26-4FC0-B557-6A1586CFC0B9}">
   <ds:schemaRefs>
     <ds:schemaRef ds:uri="http://schemas.microsoft.com/office/2006/metadata/contentType"/>
@@ -5603,7 +5813,7 @@
 </ds:datastoreItem>
 </file>
 
-<file path=customXml/itemProps3.xml><?xml version="1.0" encoding="utf-8"?>
+<file path=customXml/itemProps2.xml><?xml version="1.0" encoding="utf-8"?>
 <ds:datastoreItem xmlns:ds="http://schemas.openxmlformats.org/officeDocument/2006/customXml" ds:itemID="{0BF1CE46-C6C6-4A06-ACD6-BFE7A5A034B4}">
   <ds:schemaRefs>
     <ds:schemaRef ds:uri="http://schemas.microsoft.com/office/2006/metadata/properties"/>
@@ -5614,6 +5824,14 @@
 </ds:datastoreItem>
 </file>
 
+<file path=customXml/itemProps3.xml><?xml version="1.0" encoding="utf-8"?>
+<ds:datastoreItem xmlns:ds="http://schemas.openxmlformats.org/officeDocument/2006/customXml" ds:itemID="{77991735-DCD3-45B1-A011-77EB6015DA17}">
+  <ds:schemaRefs>
+    <ds:schemaRef ds:uri="http://schemas.microsoft.com/sharepoint/v3/contenttype/forms"/>
+  </ds:schemaRefs>
+</ds:datastoreItem>
+</file>
+
 <file path=docMetadata/LabelInfo.xml><?xml version="1.0" encoding="utf-8"?>
 <clbl:labelList xmlns:clbl="http://schemas.microsoft.com/office/2020/mipLabelMetadata">
   <clbl:label id="{50656f6f-463c-4054-9fc2-6f4071c6e7fc}" enabled="0" method="" siteId="{50656f6f-463c-4054-9fc2-6f4071c6e7fc}" removed="1"/>

</xml_diff>